<commit_message>
after adding fields to testimonials
</commit_message>
<xml_diff>
--- a/public/images/Voice Over/Vale HCC/Welcome to Vale Health Care Center.docx
+++ b/public/images/Voice Over/Vale HCC/Welcome to Vale Health Care Center.docx
@@ -102,6 +102,2036 @@
       </w:r>
       <w:r>
         <w:t>, we’re here to guide you every step of the way. Schedule a tour, meet our team, and see for yourself why families choose us as their home of choice.</w:t>
+      </w:r>
+    </w:p>
+    <w:p>
+      <w:r>
+        <w:br w:type="page"/>
+      </w:r>
+    </w:p>
+    <w:p>
+      <w:pPr>
+        <w:rPr>
+          <w:b/>
+          <w:bCs/>
+        </w:rPr>
+      </w:pPr>
+      <w:r>
+        <w:rPr>
+          <w:b/>
+          <w:bCs/>
+        </w:rPr>
+        <w:lastRenderedPageBreak/>
+        <w:t>Facility Intro Video Script (5–8 minutes)</w:t>
+      </w:r>
+    </w:p>
+    <w:p>
+      <w:pPr>
+        <w:rPr>
+          <w:b/>
+          <w:bCs/>
+        </w:rPr>
+      </w:pPr>
+      <w:r>
+        <w:rPr>
+          <w:rFonts w:ascii="Segoe UI Emoji" w:hAnsi="Segoe UI Emoji" w:cs="Segoe UI Emoji"/>
+          <w:b/>
+          <w:bCs/>
+        </w:rPr>
+        <w:t>🎬</w:t>
+      </w:r>
+      <w:r>
+        <w:rPr>
+          <w:b/>
+          <w:bCs/>
+        </w:rPr>
+        <w:t xml:space="preserve"> Opening Scene (0:00 – 0:45)</w:t>
+      </w:r>
+    </w:p>
+    <w:p>
+      <w:r>
+        <w:rPr>
+          <w:b/>
+          <w:bCs/>
+        </w:rPr>
+        <w:t>Visuals</w:t>
+      </w:r>
+      <w:r>
+        <w:t>:</w:t>
+      </w:r>
+    </w:p>
+    <w:p>
+      <w:pPr>
+        <w:numPr>
+          <w:ilvl w:val="0"/>
+          <w:numId w:val="1"/>
+        </w:numPr>
+      </w:pPr>
+      <w:r>
+        <w:t>Soft, uplifting music begins.</w:t>
+      </w:r>
+    </w:p>
+    <w:p>
+      <w:pPr>
+        <w:numPr>
+          <w:ilvl w:val="0"/>
+          <w:numId w:val="1"/>
+        </w:numPr>
+      </w:pPr>
+      <w:r>
+        <w:t>Drone or panoramic shot of the facility exterior with warm morning light.</w:t>
+      </w:r>
+    </w:p>
+    <w:p>
+      <w:pPr>
+        <w:numPr>
+          <w:ilvl w:val="0"/>
+          <w:numId w:val="1"/>
+        </w:numPr>
+      </w:pPr>
+      <w:r>
+        <w:t>Residents and staff smiling, walking together, or engaging in light activities outdoors.</w:t>
+      </w:r>
+    </w:p>
+    <w:p>
+      <w:r>
+        <w:rPr>
+          <w:b/>
+          <w:bCs/>
+        </w:rPr>
+        <w:t>Voiceover</w:t>
+      </w:r>
+      <w:r>
+        <w:t>:</w:t>
+      </w:r>
+      <w:r>
+        <w:br/>
+      </w:r>
+      <w:r>
+        <w:rPr>
+          <w:i/>
+          <w:iCs/>
+        </w:rPr>
+        <w:t xml:space="preserve">"Welcome to [Facility Name], where community and care come together. Here, every resident is more than a </w:t>
+      </w:r>
+      <w:proofErr w:type="gramStart"/>
+      <w:r>
+        <w:rPr>
+          <w:i/>
+          <w:iCs/>
+        </w:rPr>
+        <w:t>patient—</w:t>
+      </w:r>
+      <w:proofErr w:type="gramEnd"/>
+      <w:r>
+        <w:rPr>
+          <w:i/>
+          <w:iCs/>
+        </w:rPr>
+        <w:t>they are family. Our mission is simple: to create a safe, supportive, and compassionate environment where each individual can thrive."</w:t>
+      </w:r>
+    </w:p>
+    <w:p>
+      <w:r>
+        <w:pict w14:anchorId="24958EBD">
+          <v:rect id="_x0000_i1067" style="width:0;height:1.5pt" o:hralign="center" o:hrstd="t" o:hr="t" fillcolor="#a0a0a0" stroked="f"/>
+        </w:pict>
+      </w:r>
+    </w:p>
+    <w:p>
+      <w:pPr>
+        <w:rPr>
+          <w:b/>
+          <w:bCs/>
+        </w:rPr>
+      </w:pPr>
+      <w:r>
+        <w:rPr>
+          <w:rFonts w:ascii="Segoe UI Emoji" w:hAnsi="Segoe UI Emoji" w:cs="Segoe UI Emoji"/>
+          <w:b/>
+          <w:bCs/>
+        </w:rPr>
+        <w:t>🌟</w:t>
+      </w:r>
+      <w:r>
+        <w:rPr>
+          <w:b/>
+          <w:bCs/>
+        </w:rPr>
+        <w:t xml:space="preserve"> Our Philosophy of Care (0:45 – 1:45)</w:t>
+      </w:r>
+    </w:p>
+    <w:p>
+      <w:r>
+        <w:rPr>
+          <w:b/>
+          <w:bCs/>
+        </w:rPr>
+        <w:t>Visuals</w:t>
+      </w:r>
+      <w:r>
+        <w:t>:</w:t>
+      </w:r>
+    </w:p>
+    <w:p>
+      <w:pPr>
+        <w:numPr>
+          <w:ilvl w:val="0"/>
+          <w:numId w:val="2"/>
+        </w:numPr>
+      </w:pPr>
+      <w:r>
+        <w:t>Shots of caregivers assisting residents with daily activities.</w:t>
+      </w:r>
+    </w:p>
+    <w:p>
+      <w:pPr>
+        <w:numPr>
+          <w:ilvl w:val="0"/>
+          <w:numId w:val="2"/>
+        </w:numPr>
+      </w:pPr>
+      <w:r>
+        <w:t>Residents laughing, enjoying recreation, or eating together in a dining hall.</w:t>
+      </w:r>
+    </w:p>
+    <w:p>
+      <w:pPr>
+        <w:numPr>
+          <w:ilvl w:val="0"/>
+          <w:numId w:val="2"/>
+        </w:numPr>
+      </w:pPr>
+      <w:r>
+        <w:t>Caregiver offering comfort, hand-holding, or gentle encouragement.</w:t>
+      </w:r>
+    </w:p>
+    <w:p>
+      <w:r>
+        <w:rPr>
+          <w:b/>
+          <w:bCs/>
+        </w:rPr>
+        <w:t>Voiceover</w:t>
+      </w:r>
+      <w:r>
+        <w:t>:</w:t>
+      </w:r>
+      <w:r>
+        <w:br/>
+      </w:r>
+      <w:r>
+        <w:rPr>
+          <w:i/>
+          <w:iCs/>
+        </w:rPr>
+        <w:t>"At [Facility Name], we believe that true healthcare goes beyond treatments and therapies—it’s about human connection, dignity, and purpose. Every resident deserves personalized attention, evidence-based care, and the reassurance that they are valued."</w:t>
+      </w:r>
+    </w:p>
+    <w:p>
+      <w:r>
+        <w:pict w14:anchorId="1891C08E">
+          <v:rect id="_x0000_i1068" style="width:0;height:1.5pt" o:hralign="center" o:hrstd="t" o:hr="t" fillcolor="#a0a0a0" stroked="f"/>
+        </w:pict>
+      </w:r>
+    </w:p>
+    <w:p>
+      <w:pPr>
+        <w:rPr>
+          <w:b/>
+          <w:bCs/>
+        </w:rPr>
+      </w:pPr>
+      <w:r>
+        <w:rPr>
+          <w:rFonts w:ascii="Segoe UI Emoji" w:hAnsi="Segoe UI Emoji" w:cs="Segoe UI Emoji"/>
+          <w:b/>
+          <w:bCs/>
+        </w:rPr>
+        <w:t>🏥</w:t>
+      </w:r>
+      <w:r>
+        <w:rPr>
+          <w:b/>
+          <w:bCs/>
+        </w:rPr>
+        <w:t xml:space="preserve"> Our Services (1:45 – 3:00)</w:t>
+      </w:r>
+    </w:p>
+    <w:p>
+      <w:r>
+        <w:rPr>
+          <w:b/>
+          <w:bCs/>
+        </w:rPr>
+        <w:t>Visuals</w:t>
+      </w:r>
+      <w:r>
+        <w:t>:</w:t>
+      </w:r>
+    </w:p>
+    <w:p>
+      <w:pPr>
+        <w:numPr>
+          <w:ilvl w:val="0"/>
+          <w:numId w:val="3"/>
+        </w:numPr>
+      </w:pPr>
+      <w:r>
+        <w:t>Quick transitions of different wings/units: rehabilitation center, memory care unit, hospice room, therapy gym.</w:t>
+      </w:r>
+    </w:p>
+    <w:p>
+      <w:pPr>
+        <w:numPr>
+          <w:ilvl w:val="0"/>
+          <w:numId w:val="3"/>
+        </w:numPr>
+      </w:pPr>
+      <w:proofErr w:type="gramStart"/>
+      <w:r>
+        <w:t>A resident</w:t>
+      </w:r>
+      <w:proofErr w:type="gramEnd"/>
+      <w:r>
+        <w:t xml:space="preserve"> working with a physical therapist.</w:t>
+      </w:r>
+    </w:p>
+    <w:p>
+      <w:pPr>
+        <w:numPr>
+          <w:ilvl w:val="0"/>
+          <w:numId w:val="3"/>
+        </w:numPr>
+      </w:pPr>
+      <w:r>
+        <w:t>Recreational activities: painting, music, gardening.</w:t>
+      </w:r>
+    </w:p>
+    <w:p>
+      <w:r>
+        <w:rPr>
+          <w:b/>
+          <w:bCs/>
+        </w:rPr>
+        <w:lastRenderedPageBreak/>
+        <w:t>Voiceover</w:t>
+      </w:r>
+      <w:r>
+        <w:t>:</w:t>
+      </w:r>
+      <w:r>
+        <w:br/>
+      </w:r>
+      <w:r>
+        <w:rPr>
+          <w:i/>
+          <w:iCs/>
+        </w:rPr>
+        <w:t xml:space="preserve">"We are proud to offer a full spectrum of services designed to meet the unique needs of every resident. </w:t>
+      </w:r>
+      <w:proofErr w:type="gramStart"/>
+      <w:r>
+        <w:rPr>
+          <w:i/>
+          <w:iCs/>
+        </w:rPr>
+        <w:t>From skilled nursing and rehabilitation,</w:t>
+      </w:r>
+      <w:proofErr w:type="gramEnd"/>
+      <w:r>
+        <w:rPr>
+          <w:i/>
+          <w:iCs/>
+        </w:rPr>
+        <w:t xml:space="preserve"> to memory care and hospice, our programs are built on clinical excellence and delivered with compassion. Each plan of care is personalized—because no two journeys are alike."</w:t>
+      </w:r>
+    </w:p>
+    <w:p>
+      <w:r>
+        <w:pict w14:anchorId="2A94BD89">
+          <v:rect id="_x0000_i1069" style="width:0;height:1.5pt" o:hralign="center" o:hrstd="t" o:hr="t" fillcolor="#a0a0a0" stroked="f"/>
+        </w:pict>
+      </w:r>
+    </w:p>
+    <w:p>
+      <w:pPr>
+        <w:rPr>
+          <w:b/>
+          <w:bCs/>
+        </w:rPr>
+      </w:pPr>
+      <w:r>
+        <w:rPr>
+          <w:rFonts w:ascii="Segoe UI Emoji" w:hAnsi="Segoe UI Emoji" w:cs="Segoe UI Emoji"/>
+          <w:b/>
+          <w:bCs/>
+        </w:rPr>
+        <w:t>👩</w:t>
+      </w:r>
+      <w:r>
+        <w:rPr>
+          <w:b/>
+          <w:bCs/>
+        </w:rPr>
+        <w:t>‍</w:t>
+      </w:r>
+      <w:r>
+        <w:rPr>
+          <w:rFonts w:ascii="Segoe UI Emoji" w:hAnsi="Segoe UI Emoji" w:cs="Segoe UI Emoji"/>
+          <w:b/>
+          <w:bCs/>
+        </w:rPr>
+        <w:t>⚕️</w:t>
+      </w:r>
+      <w:r>
+        <w:rPr>
+          <w:b/>
+          <w:bCs/>
+        </w:rPr>
+        <w:t xml:space="preserve"> Our Team (3:00 – 4:15)</w:t>
+      </w:r>
+    </w:p>
+    <w:p>
+      <w:r>
+        <w:rPr>
+          <w:b/>
+          <w:bCs/>
+        </w:rPr>
+        <w:t>Visuals</w:t>
+      </w:r>
+      <w:r>
+        <w:t>:</w:t>
+      </w:r>
+    </w:p>
+    <w:p>
+      <w:pPr>
+        <w:numPr>
+          <w:ilvl w:val="0"/>
+          <w:numId w:val="4"/>
+        </w:numPr>
+      </w:pPr>
+      <w:r>
+        <w:t xml:space="preserve">Nurses and caregivers </w:t>
+      </w:r>
+      <w:proofErr w:type="gramStart"/>
+      <w:r>
+        <w:t>interacting</w:t>
+      </w:r>
+      <w:proofErr w:type="gramEnd"/>
+      <w:r>
+        <w:t xml:space="preserve"> warmly with residents.</w:t>
+      </w:r>
+    </w:p>
+    <w:p>
+      <w:pPr>
+        <w:numPr>
+          <w:ilvl w:val="0"/>
+          <w:numId w:val="4"/>
+        </w:numPr>
+      </w:pPr>
+      <w:r>
+        <w:t xml:space="preserve">Physicians </w:t>
+      </w:r>
+      <w:proofErr w:type="gramStart"/>
+      <w:r>
+        <w:t>consulting</w:t>
+      </w:r>
+      <w:proofErr w:type="gramEnd"/>
+      <w:r>
+        <w:t xml:space="preserve"> with families.</w:t>
+      </w:r>
+    </w:p>
+    <w:p>
+      <w:pPr>
+        <w:numPr>
+          <w:ilvl w:val="0"/>
+          <w:numId w:val="4"/>
+        </w:numPr>
+      </w:pPr>
+      <w:r>
+        <w:t>Staff training or collaborating during shift handover.</w:t>
+      </w:r>
+    </w:p>
+    <w:p>
+      <w:r>
+        <w:rPr>
+          <w:b/>
+          <w:bCs/>
+        </w:rPr>
+        <w:t>Voiceover</w:t>
+      </w:r>
+      <w:r>
+        <w:t>:</w:t>
+      </w:r>
+      <w:r>
+        <w:br/>
+      </w:r>
+      <w:r>
+        <w:rPr>
+          <w:i/>
+          <w:iCs/>
+        </w:rPr>
+        <w:t xml:space="preserve">"Behind every smile is a team of dedicated professionals. Our nurses, therapists, and caregivers are not only highly </w:t>
+      </w:r>
+      <w:proofErr w:type="gramStart"/>
+      <w:r>
+        <w:rPr>
+          <w:i/>
+          <w:iCs/>
+        </w:rPr>
+        <w:t>skilled—</w:t>
+      </w:r>
+      <w:proofErr w:type="gramEnd"/>
+      <w:r>
+        <w:rPr>
+          <w:i/>
+          <w:iCs/>
+        </w:rPr>
+        <w:t>they are passionate about creating meaningful relationships. Families often tell us that it feels like home here, and that’s exactly what we aim for."</w:t>
+      </w:r>
+    </w:p>
+    <w:p>
+      <w:r>
+        <w:pict w14:anchorId="27380238">
+          <v:rect id="_x0000_i1070" style="width:0;height:1.5pt" o:hralign="center" o:hrstd="t" o:hr="t" fillcolor="#a0a0a0" stroked="f"/>
+        </w:pict>
+      </w:r>
+    </w:p>
+    <w:p>
+      <w:pPr>
+        <w:rPr>
+          <w:b/>
+          <w:bCs/>
+        </w:rPr>
+      </w:pPr>
+      <w:r>
+        <w:rPr>
+          <w:rFonts w:ascii="Segoe UI Emoji" w:hAnsi="Segoe UI Emoji" w:cs="Segoe UI Emoji"/>
+          <w:b/>
+          <w:bCs/>
+        </w:rPr>
+        <w:t>🏆</w:t>
+      </w:r>
+      <w:r>
+        <w:rPr>
+          <w:b/>
+          <w:bCs/>
+        </w:rPr>
+        <w:t xml:space="preserve"> Trust, Safety &amp; Accreditation (4:15 – 5:15)</w:t>
+      </w:r>
+    </w:p>
+    <w:p>
+      <w:r>
+        <w:rPr>
+          <w:b/>
+          <w:bCs/>
+        </w:rPr>
+        <w:t>Visuals</w:t>
+      </w:r>
+      <w:r>
+        <w:t>:</w:t>
+      </w:r>
+    </w:p>
+    <w:p>
+      <w:pPr>
+        <w:numPr>
+          <w:ilvl w:val="0"/>
+          <w:numId w:val="5"/>
+        </w:numPr>
+      </w:pPr>
+      <w:r>
+        <w:t>Clips of clean, modern facility spaces.</w:t>
+      </w:r>
+    </w:p>
+    <w:p>
+      <w:pPr>
+        <w:numPr>
+          <w:ilvl w:val="0"/>
+          <w:numId w:val="5"/>
+        </w:numPr>
+      </w:pPr>
+      <w:r>
+        <w:t>Visuals of accreditation certificates, safety inspections, or awards.</w:t>
+      </w:r>
+    </w:p>
+    <w:p>
+      <w:pPr>
+        <w:numPr>
+          <w:ilvl w:val="0"/>
+          <w:numId w:val="5"/>
+        </w:numPr>
+      </w:pPr>
+      <w:r>
+        <w:t>A family visiting a resident with joy and comfort.</w:t>
+      </w:r>
+    </w:p>
+    <w:p>
+      <w:r>
+        <w:rPr>
+          <w:b/>
+          <w:bCs/>
+        </w:rPr>
+        <w:t>Voiceover</w:t>
+      </w:r>
+      <w:r>
+        <w:t>:</w:t>
+      </w:r>
+      <w:r>
+        <w:br/>
+      </w:r>
+      <w:r>
+        <w:rPr>
+          <w:i/>
+          <w:iCs/>
+        </w:rPr>
+        <w:t>"Trust is at the heart of what we do. That’s why we are fully licensed, regularly audited, and accredited to meet the highest standards of quality and safety. Families can rest assured knowing their loved ones are cared for in an environment that prioritizes health, comfort, and respect."</w:t>
+      </w:r>
+    </w:p>
+    <w:p>
+      <w:r>
+        <w:pict w14:anchorId="2AB9E2D4">
+          <v:rect id="_x0000_i1071" style="width:0;height:1.5pt" o:hralign="center" o:hrstd="t" o:hr="t" fillcolor="#a0a0a0" stroked="f"/>
+        </w:pict>
+      </w:r>
+    </w:p>
+    <w:p>
+      <w:pPr>
+        <w:rPr>
+          <w:b/>
+          <w:bCs/>
+        </w:rPr>
+      </w:pPr>
+      <w:r>
+        <w:rPr>
+          <w:rFonts w:ascii="Segoe UI Emoji" w:hAnsi="Segoe UI Emoji" w:cs="Segoe UI Emoji"/>
+          <w:b/>
+          <w:bCs/>
+        </w:rPr>
+        <w:t>🌺</w:t>
+      </w:r>
+      <w:r>
+        <w:rPr>
+          <w:b/>
+          <w:bCs/>
+        </w:rPr>
+        <w:t xml:space="preserve"> Resident &amp; Family Experience (5:15 – 6:30)</w:t>
+      </w:r>
+    </w:p>
+    <w:p>
+      <w:r>
+        <w:rPr>
+          <w:b/>
+          <w:bCs/>
+        </w:rPr>
+        <w:lastRenderedPageBreak/>
+        <w:t>Visuals</w:t>
+      </w:r>
+      <w:r>
+        <w:t>:</w:t>
+      </w:r>
+    </w:p>
+    <w:p>
+      <w:pPr>
+        <w:numPr>
+          <w:ilvl w:val="0"/>
+          <w:numId w:val="6"/>
+        </w:numPr>
+      </w:pPr>
+      <w:r>
+        <w:t>Family members hugging residents.</w:t>
+      </w:r>
+    </w:p>
+    <w:p>
+      <w:pPr>
+        <w:numPr>
+          <w:ilvl w:val="0"/>
+          <w:numId w:val="6"/>
+        </w:numPr>
+      </w:pPr>
+      <w:r>
+        <w:t xml:space="preserve">Residents </w:t>
+      </w:r>
+      <w:proofErr w:type="gramStart"/>
+      <w:r>
+        <w:t>enjoying</w:t>
+      </w:r>
+      <w:proofErr w:type="gramEnd"/>
+      <w:r>
+        <w:t xml:space="preserve"> group recreation like music, games, or gardening.</w:t>
+      </w:r>
+    </w:p>
+    <w:p>
+      <w:pPr>
+        <w:numPr>
+          <w:ilvl w:val="0"/>
+          <w:numId w:val="6"/>
+        </w:numPr>
+      </w:pPr>
+      <w:r>
+        <w:t>Testimonial clips (if available).</w:t>
+      </w:r>
+    </w:p>
+    <w:p>
+      <w:r>
+        <w:rPr>
+          <w:b/>
+          <w:bCs/>
+        </w:rPr>
+        <w:t>Voiceover</w:t>
+      </w:r>
+      <w:r>
+        <w:t>:</w:t>
+      </w:r>
+      <w:r>
+        <w:br/>
+      </w:r>
+      <w:r>
+        <w:rPr>
+          <w:i/>
+          <w:iCs/>
+        </w:rPr>
+        <w:t>"What truly sets us apart is the experience. Families feel peace of mind, residents feel dignity and independence, and physicians trust the quality of our care. Every moment here is a chance to create joy and purpose."</w:t>
+      </w:r>
+    </w:p>
+    <w:p>
+      <w:r>
+        <w:pict w14:anchorId="383FB99B">
+          <v:rect id="_x0000_i1072" style="width:0;height:1.5pt" o:hralign="center" o:hrstd="t" o:hr="t" fillcolor="#a0a0a0" stroked="f"/>
+        </w:pict>
+      </w:r>
+    </w:p>
+    <w:p>
+      <w:pPr>
+        <w:rPr>
+          <w:b/>
+          <w:bCs/>
+        </w:rPr>
+      </w:pPr>
+      <w:r>
+        <w:rPr>
+          <w:rFonts w:ascii="Segoe UI Emoji" w:hAnsi="Segoe UI Emoji" w:cs="Segoe UI Emoji"/>
+          <w:b/>
+          <w:bCs/>
+        </w:rPr>
+        <w:t>💡</w:t>
+      </w:r>
+      <w:r>
+        <w:rPr>
+          <w:b/>
+          <w:bCs/>
+        </w:rPr>
+        <w:t xml:space="preserve"> Call to Action (6:30 – 7:30)</w:t>
+      </w:r>
+    </w:p>
+    <w:p>
+      <w:r>
+        <w:rPr>
+          <w:b/>
+          <w:bCs/>
+        </w:rPr>
+        <w:t>Visuals</w:t>
+      </w:r>
+      <w:r>
+        <w:t>:</w:t>
+      </w:r>
+    </w:p>
+    <w:p>
+      <w:pPr>
+        <w:numPr>
+          <w:ilvl w:val="0"/>
+          <w:numId w:val="7"/>
+        </w:numPr>
+      </w:pPr>
+      <w:r>
+        <w:t xml:space="preserve">Caregiver </w:t>
+      </w:r>
+      <w:proofErr w:type="gramStart"/>
+      <w:r>
+        <w:t>walking</w:t>
+      </w:r>
+      <w:proofErr w:type="gramEnd"/>
+      <w:r>
+        <w:t xml:space="preserve"> </w:t>
+      </w:r>
+      <w:proofErr w:type="gramStart"/>
+      <w:r>
+        <w:t>hand-in-hand</w:t>
+      </w:r>
+      <w:proofErr w:type="gramEnd"/>
+      <w:r>
+        <w:t xml:space="preserve"> with a resident.</w:t>
+      </w:r>
+    </w:p>
+    <w:p>
+      <w:pPr>
+        <w:numPr>
+          <w:ilvl w:val="0"/>
+          <w:numId w:val="7"/>
+        </w:numPr>
+      </w:pPr>
+      <w:r>
+        <w:t xml:space="preserve">A shot of the facility </w:t>
+      </w:r>
+      <w:proofErr w:type="gramStart"/>
+      <w:r>
+        <w:t>sign</w:t>
+      </w:r>
+      <w:proofErr w:type="gramEnd"/>
+      <w:r>
+        <w:t xml:space="preserve"> with sun setting beautifully.</w:t>
+      </w:r>
+    </w:p>
+    <w:p>
+      <w:pPr>
+        <w:numPr>
+          <w:ilvl w:val="0"/>
+          <w:numId w:val="7"/>
+        </w:numPr>
+      </w:pPr>
+      <w:r>
+        <w:t>Staff waving at the camera, welcoming future residents.</w:t>
+      </w:r>
+    </w:p>
+    <w:p>
+      <w:r>
+        <w:rPr>
+          <w:b/>
+          <w:bCs/>
+        </w:rPr>
+        <w:t>Voiceover</w:t>
+      </w:r>
+      <w:r>
+        <w:t>:</w:t>
+      </w:r>
+      <w:r>
+        <w:br/>
+      </w:r>
+      <w:r>
+        <w:rPr>
+          <w:i/>
+          <w:iCs/>
+        </w:rPr>
+        <w:t>"Choosing the right care is one of the most important decisions you’ll ever make. At [Facility Name], we’re here to guide you every step of the way. Schedule a tour, meet our team, and see for yourself why families choose us as their home of choice."</w:t>
+      </w:r>
+    </w:p>
+    <w:p>
+      <w:r>
+        <w:rPr>
+          <w:b/>
+          <w:bCs/>
+        </w:rPr>
+        <w:t>On-screen text</w:t>
+      </w:r>
+      <w:r>
+        <w:t>:</w:t>
+      </w:r>
+    </w:p>
+    <w:p>
+      <w:pPr>
+        <w:numPr>
+          <w:ilvl w:val="0"/>
+          <w:numId w:val="8"/>
+        </w:numPr>
+      </w:pPr>
+      <w:r>
+        <w:t>Website URL</w:t>
+      </w:r>
+    </w:p>
+    <w:p>
+      <w:pPr>
+        <w:numPr>
+          <w:ilvl w:val="0"/>
+          <w:numId w:val="8"/>
+        </w:numPr>
+      </w:pPr>
+      <w:r>
+        <w:t>Phone number</w:t>
+      </w:r>
+    </w:p>
+    <w:p>
+      <w:pPr>
+        <w:numPr>
+          <w:ilvl w:val="0"/>
+          <w:numId w:val="8"/>
+        </w:numPr>
+      </w:pPr>
+      <w:r>
+        <w:t>"Book a Tour Today"</w:t>
+      </w:r>
+    </w:p>
+    <w:p>
+      <w:r>
+        <w:pict w14:anchorId="7FC039EF">
+          <v:rect id="_x0000_i1073" style="width:0;height:1.5pt" o:hralign="center" o:hrstd="t" o:hr="t" fillcolor="#a0a0a0" stroked="f"/>
+        </w:pict>
+      </w:r>
+    </w:p>
+    <w:p>
+      <w:pPr>
+        <w:rPr>
+          <w:b/>
+          <w:bCs/>
+        </w:rPr>
+      </w:pPr>
+      <w:r>
+        <w:rPr>
+          <w:rFonts w:ascii="Segoe UI Emoji" w:hAnsi="Segoe UI Emoji" w:cs="Segoe UI Emoji"/>
+          <w:b/>
+          <w:bCs/>
+        </w:rPr>
+        <w:t>🎵</w:t>
+      </w:r>
+      <w:r>
+        <w:rPr>
+          <w:b/>
+          <w:bCs/>
+        </w:rPr>
+        <w:t xml:space="preserve"> Closing Scene (7:30 – 8:00)</w:t>
+      </w:r>
+    </w:p>
+    <w:p>
+      <w:r>
+        <w:rPr>
+          <w:b/>
+          <w:bCs/>
+        </w:rPr>
+        <w:t>Visuals</w:t>
+      </w:r>
+      <w:r>
+        <w:t>:</w:t>
+      </w:r>
+    </w:p>
+    <w:p>
+      <w:pPr>
+        <w:numPr>
+          <w:ilvl w:val="0"/>
+          <w:numId w:val="9"/>
+        </w:numPr>
+      </w:pPr>
+      <w:r>
+        <w:t xml:space="preserve">Fade to the facility logo with tagline: </w:t>
+      </w:r>
+      <w:r>
+        <w:rPr>
+          <w:i/>
+          <w:iCs/>
+        </w:rPr>
+        <w:t>“Where Community and Care Come Together.”</w:t>
+      </w:r>
+    </w:p>
+    <w:p>
+      <w:pPr>
+        <w:numPr>
+          <w:ilvl w:val="0"/>
+          <w:numId w:val="9"/>
+        </w:numPr>
+      </w:pPr>
+      <w:r>
+        <w:t>Soft background music fades out.</w:t>
+      </w:r>
+    </w:p>
+    <w:p>
+      <w:pPr>
+        <w:rPr>
+          <w:b/>
+          <w:bCs/>
+        </w:rPr>
+      </w:pPr>
+      <w:r>
+        <w:br w:type="page"/>
+      </w:r>
+      <w:r>
+        <w:rPr>
+          <w:b/>
+          <w:bCs/>
+        </w:rPr>
+        <w:lastRenderedPageBreak/>
+        <w:t>Storyboard &amp; Shot List for Facility Intro Video</w:t>
+      </w:r>
+    </w:p>
+    <w:p>
+      <w:pPr>
+        <w:rPr>
+          <w:b/>
+          <w:bCs/>
+        </w:rPr>
+      </w:pPr>
+      <w:r>
+        <w:rPr>
+          <w:rFonts w:ascii="Segoe UI Emoji" w:hAnsi="Segoe UI Emoji" w:cs="Segoe UI Emoji"/>
+          <w:b/>
+          <w:bCs/>
+        </w:rPr>
+        <w:t>🎬</w:t>
+      </w:r>
+      <w:r>
+        <w:rPr>
+          <w:b/>
+          <w:bCs/>
+        </w:rPr>
+        <w:t xml:space="preserve"> Opening Scene (0:00 – 0:45)</w:t>
+      </w:r>
+    </w:p>
+    <w:p>
+      <w:r>
+        <w:rPr>
+          <w:b/>
+          <w:bCs/>
+        </w:rPr>
+        <w:t>Script focus</w:t>
+      </w:r>
+      <w:r>
+        <w:t>: Warm welcome, first impression.</w:t>
+      </w:r>
+      <w:r>
+        <w:br/>
+      </w:r>
+      <w:r>
+        <w:rPr>
+          <w:b/>
+          <w:bCs/>
+        </w:rPr>
+        <w:t>Shots</w:t>
+      </w:r>
+      <w:r>
+        <w:t>:</w:t>
+      </w:r>
+    </w:p>
+    <w:p>
+      <w:pPr>
+        <w:numPr>
+          <w:ilvl w:val="0"/>
+          <w:numId w:val="10"/>
+        </w:numPr>
+      </w:pPr>
+      <w:r>
+        <w:rPr>
+          <w:b/>
+          <w:bCs/>
+        </w:rPr>
+        <w:t>Drone shot</w:t>
+      </w:r>
+      <w:r>
+        <w:t>: Facility exterior in the morning (wide angle).</w:t>
+      </w:r>
+    </w:p>
+    <w:p>
+      <w:pPr>
+        <w:numPr>
+          <w:ilvl w:val="0"/>
+          <w:numId w:val="10"/>
+        </w:numPr>
+      </w:pPr>
+      <w:r>
+        <w:rPr>
+          <w:b/>
+          <w:bCs/>
+        </w:rPr>
+        <w:t>Tracking shot</w:t>
+      </w:r>
+      <w:r>
+        <w:t>: Residents walking with caregivers outdoors.</w:t>
+      </w:r>
+    </w:p>
+    <w:p>
+      <w:pPr>
+        <w:numPr>
+          <w:ilvl w:val="0"/>
+          <w:numId w:val="10"/>
+        </w:numPr>
+      </w:pPr>
+      <w:r>
+        <w:rPr>
+          <w:b/>
+          <w:bCs/>
+        </w:rPr>
+        <w:t>Close-up</w:t>
+      </w:r>
+      <w:r>
+        <w:t>: Smiling faces, hands touching.</w:t>
+      </w:r>
+    </w:p>
+    <w:p>
+      <w:pPr>
+        <w:numPr>
+          <w:ilvl w:val="0"/>
+          <w:numId w:val="10"/>
+        </w:numPr>
+      </w:pPr>
+      <w:r>
+        <w:rPr>
+          <w:b/>
+          <w:bCs/>
+        </w:rPr>
+        <w:t>Overlay text (optional)</w:t>
+      </w:r>
+      <w:r>
+        <w:t xml:space="preserve">: </w:t>
+      </w:r>
+      <w:r>
+        <w:rPr>
+          <w:i/>
+          <w:iCs/>
+        </w:rPr>
+        <w:t>“Welcome to [Facility Name]”</w:t>
+      </w:r>
+      <w:r>
+        <w:t>.</w:t>
+      </w:r>
+    </w:p>
+    <w:p>
+      <w:r>
+        <w:pict w14:anchorId="298BDB1D">
+          <v:rect id="_x0000_i1129" style="width:0;height:1.5pt" o:hralign="center" o:hrstd="t" o:hr="t" fillcolor="#a0a0a0" stroked="f"/>
+        </w:pict>
+      </w:r>
+    </w:p>
+    <w:p>
+      <w:pPr>
+        <w:rPr>
+          <w:b/>
+          <w:bCs/>
+        </w:rPr>
+      </w:pPr>
+      <w:r>
+        <w:rPr>
+          <w:rFonts w:ascii="Segoe UI Emoji" w:hAnsi="Segoe UI Emoji" w:cs="Segoe UI Emoji"/>
+          <w:b/>
+          <w:bCs/>
+        </w:rPr>
+        <w:t>🌟</w:t>
+      </w:r>
+      <w:r>
+        <w:rPr>
+          <w:b/>
+          <w:bCs/>
+        </w:rPr>
+        <w:t xml:space="preserve"> Our Philosophy of Care (0:45 – 1:45)</w:t>
+      </w:r>
+    </w:p>
+    <w:p>
+      <w:r>
+        <w:rPr>
+          <w:b/>
+          <w:bCs/>
+        </w:rPr>
+        <w:t>Script focus</w:t>
+      </w:r>
+      <w:r>
+        <w:t>: Human connection + dignity.</w:t>
+      </w:r>
+      <w:r>
+        <w:br/>
+      </w:r>
+      <w:r>
+        <w:rPr>
+          <w:b/>
+          <w:bCs/>
+        </w:rPr>
+        <w:t>Shots</w:t>
+      </w:r>
+      <w:r>
+        <w:t>:</w:t>
+      </w:r>
+    </w:p>
+    <w:p>
+      <w:pPr>
+        <w:numPr>
+          <w:ilvl w:val="0"/>
+          <w:numId w:val="11"/>
+        </w:numPr>
+      </w:pPr>
+      <w:r>
+        <w:rPr>
+          <w:b/>
+          <w:bCs/>
+        </w:rPr>
+        <w:t>Medium shot</w:t>
+      </w:r>
+      <w:r>
+        <w:t>: Nurse helping a resident with daily activity (e.g., reading, writing).</w:t>
+      </w:r>
+    </w:p>
+    <w:p>
+      <w:pPr>
+        <w:numPr>
+          <w:ilvl w:val="0"/>
+          <w:numId w:val="11"/>
+        </w:numPr>
+      </w:pPr>
+      <w:r>
+        <w:rPr>
+          <w:b/>
+          <w:bCs/>
+        </w:rPr>
+        <w:t>Close-up</w:t>
+      </w:r>
+      <w:r>
+        <w:t>: Caregiver holding a resident’s hand.</w:t>
+      </w:r>
+    </w:p>
+    <w:p>
+      <w:pPr>
+        <w:numPr>
+          <w:ilvl w:val="0"/>
+          <w:numId w:val="11"/>
+        </w:numPr>
+      </w:pPr>
+      <w:r>
+        <w:rPr>
+          <w:b/>
+          <w:bCs/>
+        </w:rPr>
+        <w:t>Group shot</w:t>
+      </w:r>
+      <w:r>
+        <w:t>: Residents laughing during social activity.</w:t>
+      </w:r>
+    </w:p>
+    <w:p>
+      <w:pPr>
+        <w:numPr>
+          <w:ilvl w:val="0"/>
+          <w:numId w:val="11"/>
+        </w:numPr>
+      </w:pPr>
+      <w:r>
+        <w:rPr>
+          <w:b/>
+          <w:bCs/>
+        </w:rPr>
+        <w:t>Cutaway</w:t>
+      </w:r>
+      <w:r>
+        <w:t>: Dining scene with conversations and meals.</w:t>
+      </w:r>
+    </w:p>
+    <w:p>
+      <w:r>
+        <w:pict w14:anchorId="7561AA38">
+          <v:rect id="_x0000_i1130" style="width:0;height:1.5pt" o:hralign="center" o:hrstd="t" o:hr="t" fillcolor="#a0a0a0" stroked="f"/>
+        </w:pict>
+      </w:r>
+    </w:p>
+    <w:p>
+      <w:pPr>
+        <w:rPr>
+          <w:b/>
+          <w:bCs/>
+        </w:rPr>
+      </w:pPr>
+      <w:r>
+        <w:rPr>
+          <w:rFonts w:ascii="Segoe UI Emoji" w:hAnsi="Segoe UI Emoji" w:cs="Segoe UI Emoji"/>
+          <w:b/>
+          <w:bCs/>
+        </w:rPr>
+        <w:t>🏥</w:t>
+      </w:r>
+      <w:r>
+        <w:rPr>
+          <w:b/>
+          <w:bCs/>
+        </w:rPr>
+        <w:t xml:space="preserve"> Our Services (1:45 – 3:00)</w:t>
+      </w:r>
+    </w:p>
+    <w:p>
+      <w:r>
+        <w:rPr>
+          <w:b/>
+          <w:bCs/>
+        </w:rPr>
+        <w:t>Script focus</w:t>
+      </w:r>
+      <w:r>
+        <w:t>: Full range of services.</w:t>
+      </w:r>
+      <w:r>
+        <w:br/>
+      </w:r>
+      <w:r>
+        <w:rPr>
+          <w:b/>
+          <w:bCs/>
+        </w:rPr>
+        <w:t>Shots</w:t>
+      </w:r>
+      <w:r>
+        <w:t>:</w:t>
+      </w:r>
+    </w:p>
+    <w:p>
+      <w:pPr>
+        <w:numPr>
+          <w:ilvl w:val="0"/>
+          <w:numId w:val="12"/>
+        </w:numPr>
+      </w:pPr>
+      <w:r>
+        <w:rPr>
+          <w:b/>
+          <w:bCs/>
+        </w:rPr>
+        <w:t>Wide shot</w:t>
+      </w:r>
+      <w:r>
+        <w:t>: Rehabilitation therapy in session.</w:t>
+      </w:r>
+    </w:p>
+    <w:p>
+      <w:pPr>
+        <w:numPr>
+          <w:ilvl w:val="0"/>
+          <w:numId w:val="12"/>
+        </w:numPr>
+      </w:pPr>
+      <w:r>
+        <w:rPr>
+          <w:b/>
+          <w:bCs/>
+        </w:rPr>
+        <w:t>Close-up</w:t>
+      </w:r>
+      <w:r>
+        <w:t>: Resident in physical therapy equipment.</w:t>
+      </w:r>
+    </w:p>
+    <w:p>
+      <w:pPr>
+        <w:numPr>
+          <w:ilvl w:val="0"/>
+          <w:numId w:val="12"/>
+        </w:numPr>
+      </w:pPr>
+      <w:r>
+        <w:rPr>
+          <w:b/>
+          <w:bCs/>
+        </w:rPr>
+        <w:t>Medium shot</w:t>
+      </w:r>
+      <w:r>
+        <w:t>: Memory care activity (puzzles, sensory exercises).</w:t>
+      </w:r>
+    </w:p>
+    <w:p>
+      <w:pPr>
+        <w:numPr>
+          <w:ilvl w:val="0"/>
+          <w:numId w:val="12"/>
+        </w:numPr>
+      </w:pPr>
+      <w:r>
+        <w:rPr>
+          <w:b/>
+          <w:bCs/>
+        </w:rPr>
+        <w:t>Wide shot</w:t>
+      </w:r>
+      <w:r>
+        <w:t>: Quiet, peaceful hospice room.</w:t>
+      </w:r>
+    </w:p>
+    <w:p>
+      <w:pPr>
+        <w:numPr>
+          <w:ilvl w:val="0"/>
+          <w:numId w:val="12"/>
+        </w:numPr>
+      </w:pPr>
+      <w:r>
+        <w:rPr>
+          <w:b/>
+          <w:bCs/>
+        </w:rPr>
+        <w:t>Cutaway</w:t>
+      </w:r>
+      <w:r>
+        <w:t>: Recreational activities (gardening, music, painting).</w:t>
+      </w:r>
+    </w:p>
+    <w:p>
+      <w:r>
+        <w:pict w14:anchorId="3ECC1982">
+          <v:rect id="_x0000_i1131" style="width:0;height:1.5pt" o:hralign="center" o:hrstd="t" o:hr="t" fillcolor="#a0a0a0" stroked="f"/>
+        </w:pict>
+      </w:r>
+    </w:p>
+    <w:p>
+      <w:pPr>
+        <w:rPr>
+          <w:b/>
+          <w:bCs/>
+        </w:rPr>
+      </w:pPr>
+      <w:r>
+        <w:rPr>
+          <w:rFonts w:ascii="Segoe UI Emoji" w:hAnsi="Segoe UI Emoji" w:cs="Segoe UI Emoji"/>
+          <w:b/>
+          <w:bCs/>
+        </w:rPr>
+        <w:t>👩</w:t>
+      </w:r>
+      <w:r>
+        <w:rPr>
+          <w:b/>
+          <w:bCs/>
+        </w:rPr>
+        <w:t>‍</w:t>
+      </w:r>
+      <w:r>
+        <w:rPr>
+          <w:rFonts w:ascii="Segoe UI Emoji" w:hAnsi="Segoe UI Emoji" w:cs="Segoe UI Emoji"/>
+          <w:b/>
+          <w:bCs/>
+        </w:rPr>
+        <w:t>⚕️</w:t>
+      </w:r>
+      <w:r>
+        <w:rPr>
+          <w:b/>
+          <w:bCs/>
+        </w:rPr>
+        <w:t xml:space="preserve"> Our Team (3:00 – 4:15)</w:t>
+      </w:r>
+    </w:p>
+    <w:p>
+      <w:r>
+        <w:rPr>
+          <w:b/>
+          <w:bCs/>
+        </w:rPr>
+        <w:lastRenderedPageBreak/>
+        <w:t>Script focus</w:t>
+      </w:r>
+      <w:r>
+        <w:t>: Dedicated professionals.</w:t>
+      </w:r>
+      <w:r>
+        <w:br/>
+      </w:r>
+      <w:r>
+        <w:rPr>
+          <w:b/>
+          <w:bCs/>
+        </w:rPr>
+        <w:t>Shots</w:t>
+      </w:r>
+      <w:r>
+        <w:t>:</w:t>
+      </w:r>
+    </w:p>
+    <w:p>
+      <w:pPr>
+        <w:numPr>
+          <w:ilvl w:val="0"/>
+          <w:numId w:val="13"/>
+        </w:numPr>
+      </w:pPr>
+      <w:r>
+        <w:rPr>
+          <w:b/>
+          <w:bCs/>
+        </w:rPr>
+        <w:t>Medium shot</w:t>
+      </w:r>
+      <w:r>
+        <w:t>: Nurse assisting a resident with medication.</w:t>
+      </w:r>
+    </w:p>
+    <w:p>
+      <w:pPr>
+        <w:numPr>
+          <w:ilvl w:val="0"/>
+          <w:numId w:val="13"/>
+        </w:numPr>
+      </w:pPr>
+      <w:r>
+        <w:rPr>
+          <w:b/>
+          <w:bCs/>
+        </w:rPr>
+        <w:t>Over-the-shoulder shot</w:t>
+      </w:r>
+      <w:r>
+        <w:t>: Physician discussing care plan with family.</w:t>
+      </w:r>
+    </w:p>
+    <w:p>
+      <w:pPr>
+        <w:numPr>
+          <w:ilvl w:val="0"/>
+          <w:numId w:val="13"/>
+        </w:numPr>
+      </w:pPr>
+      <w:r>
+        <w:rPr>
+          <w:b/>
+          <w:bCs/>
+        </w:rPr>
+        <w:t>Group shot</w:t>
+      </w:r>
+      <w:r>
+        <w:t>: Staff collaborating in a shift handover meeting.</w:t>
+      </w:r>
+    </w:p>
+    <w:p>
+      <w:pPr>
+        <w:numPr>
+          <w:ilvl w:val="0"/>
+          <w:numId w:val="13"/>
+        </w:numPr>
+      </w:pPr>
+      <w:r>
+        <w:rPr>
+          <w:b/>
+          <w:bCs/>
+        </w:rPr>
+        <w:t>Close-up</w:t>
+      </w:r>
+      <w:r>
+        <w:t>: Smiling caregiver greeting a resident.</w:t>
+      </w:r>
+    </w:p>
+    <w:p>
+      <w:r>
+        <w:pict w14:anchorId="36FB711C">
+          <v:rect id="_x0000_i1132" style="width:0;height:1.5pt" o:hralign="center" o:hrstd="t" o:hr="t" fillcolor="#a0a0a0" stroked="f"/>
+        </w:pict>
+      </w:r>
+    </w:p>
+    <w:p>
+      <w:pPr>
+        <w:rPr>
+          <w:b/>
+          <w:bCs/>
+        </w:rPr>
+      </w:pPr>
+      <w:r>
+        <w:rPr>
+          <w:rFonts w:ascii="Segoe UI Emoji" w:hAnsi="Segoe UI Emoji" w:cs="Segoe UI Emoji"/>
+          <w:b/>
+          <w:bCs/>
+        </w:rPr>
+        <w:t>🏆</w:t>
+      </w:r>
+      <w:r>
+        <w:rPr>
+          <w:b/>
+          <w:bCs/>
+        </w:rPr>
+        <w:t xml:space="preserve"> Trust, Safety &amp; Accreditation (4:15 – 5:15)</w:t>
+      </w:r>
+    </w:p>
+    <w:p>
+      <w:r>
+        <w:rPr>
+          <w:b/>
+          <w:bCs/>
+        </w:rPr>
+        <w:t>Script focus</w:t>
+      </w:r>
+      <w:r>
+        <w:t>: Licenses, audits, quality.</w:t>
+      </w:r>
+      <w:r>
+        <w:br/>
+      </w:r>
+      <w:r>
+        <w:rPr>
+          <w:b/>
+          <w:bCs/>
+        </w:rPr>
+        <w:t>Shots</w:t>
+      </w:r>
+      <w:r>
+        <w:t>:</w:t>
+      </w:r>
+    </w:p>
+    <w:p>
+      <w:pPr>
+        <w:numPr>
+          <w:ilvl w:val="0"/>
+          <w:numId w:val="14"/>
+        </w:numPr>
+      </w:pPr>
+      <w:r>
+        <w:rPr>
+          <w:b/>
+          <w:bCs/>
+        </w:rPr>
+        <w:t>Close-up</w:t>
+      </w:r>
+      <w:r>
+        <w:t>: Accreditation plaques and certificates.</w:t>
+      </w:r>
+    </w:p>
+    <w:p>
+      <w:pPr>
+        <w:numPr>
+          <w:ilvl w:val="0"/>
+          <w:numId w:val="14"/>
+        </w:numPr>
+      </w:pPr>
+      <w:r>
+        <w:rPr>
+          <w:b/>
+          <w:bCs/>
+        </w:rPr>
+        <w:t>Wide shot</w:t>
+      </w:r>
+      <w:r>
+        <w:t>: Clean, modern facility hallways.</w:t>
+      </w:r>
+    </w:p>
+    <w:p>
+      <w:pPr>
+        <w:numPr>
+          <w:ilvl w:val="0"/>
+          <w:numId w:val="14"/>
+        </w:numPr>
+      </w:pPr>
+      <w:r>
+        <w:rPr>
+          <w:b/>
+          <w:bCs/>
+        </w:rPr>
+        <w:t>Medium shot</w:t>
+      </w:r>
+      <w:r>
+        <w:t>: Safety inspection in progress.</w:t>
+      </w:r>
+    </w:p>
+    <w:p>
+      <w:pPr>
+        <w:numPr>
+          <w:ilvl w:val="0"/>
+          <w:numId w:val="14"/>
+        </w:numPr>
+      </w:pPr>
+      <w:r>
+        <w:rPr>
+          <w:b/>
+          <w:bCs/>
+        </w:rPr>
+        <w:t>Family interaction</w:t>
+      </w:r>
+      <w:r>
+        <w:t>: A daughter hugging her parent in a resident room.</w:t>
+      </w:r>
+    </w:p>
+    <w:p>
+      <w:r>
+        <w:pict w14:anchorId="672F13B0">
+          <v:rect id="_x0000_i1133" style="width:0;height:1.5pt" o:hralign="center" o:hrstd="t" o:hr="t" fillcolor="#a0a0a0" stroked="f"/>
+        </w:pict>
+      </w:r>
+    </w:p>
+    <w:p>
+      <w:pPr>
+        <w:rPr>
+          <w:b/>
+          <w:bCs/>
+        </w:rPr>
+      </w:pPr>
+      <w:r>
+        <w:rPr>
+          <w:rFonts w:ascii="Segoe UI Emoji" w:hAnsi="Segoe UI Emoji" w:cs="Segoe UI Emoji"/>
+          <w:b/>
+          <w:bCs/>
+        </w:rPr>
+        <w:t>🌺</w:t>
+      </w:r>
+      <w:r>
+        <w:rPr>
+          <w:b/>
+          <w:bCs/>
+        </w:rPr>
+        <w:t xml:space="preserve"> Resident &amp; Family Experience (5:15 – 6:30)</w:t>
+      </w:r>
+    </w:p>
+    <w:p>
+      <w:r>
+        <w:rPr>
+          <w:b/>
+          <w:bCs/>
+        </w:rPr>
+        <w:t>Script focus</w:t>
+      </w:r>
+      <w:r>
+        <w:t>: Testimonies &amp; experiences.</w:t>
+      </w:r>
+      <w:r>
+        <w:br/>
+      </w:r>
+      <w:r>
+        <w:rPr>
+          <w:b/>
+          <w:bCs/>
+        </w:rPr>
+        <w:t>Shots</w:t>
+      </w:r>
+      <w:r>
+        <w:t>:</w:t>
+      </w:r>
+    </w:p>
+    <w:p>
+      <w:pPr>
+        <w:numPr>
+          <w:ilvl w:val="0"/>
+          <w:numId w:val="15"/>
+        </w:numPr>
+      </w:pPr>
+      <w:r>
+        <w:rPr>
+          <w:b/>
+          <w:bCs/>
+        </w:rPr>
+        <w:t>Medium shot</w:t>
+      </w:r>
+      <w:r>
+        <w:t>: Family visiting resident in recreation room.</w:t>
+      </w:r>
+    </w:p>
+    <w:p>
+      <w:pPr>
+        <w:numPr>
+          <w:ilvl w:val="0"/>
+          <w:numId w:val="15"/>
+        </w:numPr>
+      </w:pPr>
+      <w:r>
+        <w:rPr>
+          <w:b/>
+          <w:bCs/>
+        </w:rPr>
+        <w:t>Close-up</w:t>
+      </w:r>
+      <w:r>
+        <w:t>: Resident smiling while showing a craft or drawing.</w:t>
+      </w:r>
+    </w:p>
+    <w:p>
+      <w:pPr>
+        <w:numPr>
+          <w:ilvl w:val="0"/>
+          <w:numId w:val="15"/>
+        </w:numPr>
+      </w:pPr>
+      <w:r>
+        <w:rPr>
+          <w:b/>
+          <w:bCs/>
+        </w:rPr>
+        <w:t>Cutaway</w:t>
+      </w:r>
+      <w:r>
+        <w:t>: Residents engaged in group games.</w:t>
+      </w:r>
+    </w:p>
+    <w:p>
+      <w:pPr>
+        <w:numPr>
+          <w:ilvl w:val="0"/>
+          <w:numId w:val="15"/>
+        </w:numPr>
+      </w:pPr>
+      <w:r>
+        <w:rPr>
+          <w:b/>
+          <w:bCs/>
+        </w:rPr>
+        <w:t>Optional</w:t>
+      </w:r>
+      <w:r>
+        <w:t>: Testimonial clips from family members or residents.</w:t>
+      </w:r>
+    </w:p>
+    <w:p>
+      <w:r>
+        <w:pict w14:anchorId="141342F2">
+          <v:rect id="_x0000_i1134" style="width:0;height:1.5pt" o:hralign="center" o:hrstd="t" o:hr="t" fillcolor="#a0a0a0" stroked="f"/>
+        </w:pict>
+      </w:r>
+    </w:p>
+    <w:p>
+      <w:pPr>
+        <w:rPr>
+          <w:b/>
+          <w:bCs/>
+        </w:rPr>
+      </w:pPr>
+      <w:r>
+        <w:rPr>
+          <w:rFonts w:ascii="Segoe UI Emoji" w:hAnsi="Segoe UI Emoji" w:cs="Segoe UI Emoji"/>
+          <w:b/>
+          <w:bCs/>
+        </w:rPr>
+        <w:t>💡</w:t>
+      </w:r>
+      <w:r>
+        <w:rPr>
+          <w:b/>
+          <w:bCs/>
+        </w:rPr>
+        <w:t xml:space="preserve"> Call to Action (6:30 – 7:30)</w:t>
+      </w:r>
+    </w:p>
+    <w:p>
+      <w:r>
+        <w:rPr>
+          <w:b/>
+          <w:bCs/>
+        </w:rPr>
+        <w:t>Script focus</w:t>
+      </w:r>
+      <w:r>
+        <w:t>: Invitation to act.</w:t>
+      </w:r>
+      <w:r>
+        <w:br/>
+      </w:r>
+      <w:r>
+        <w:rPr>
+          <w:b/>
+          <w:bCs/>
+        </w:rPr>
+        <w:t>Shots</w:t>
+      </w:r>
+      <w:r>
+        <w:t>:</w:t>
+      </w:r>
+    </w:p>
+    <w:p>
+      <w:pPr>
+        <w:numPr>
+          <w:ilvl w:val="0"/>
+          <w:numId w:val="16"/>
+        </w:numPr>
+      </w:pPr>
+      <w:r>
+        <w:rPr>
+          <w:b/>
+          <w:bCs/>
+        </w:rPr>
+        <w:t>Medium shot</w:t>
+      </w:r>
+      <w:r>
+        <w:t>: Caregiver walking with resident down a hallway, warmly chatting.</w:t>
+      </w:r>
+    </w:p>
+    <w:p>
+      <w:pPr>
+        <w:numPr>
+          <w:ilvl w:val="0"/>
+          <w:numId w:val="16"/>
+        </w:numPr>
+      </w:pPr>
+      <w:r>
+        <w:rPr>
+          <w:b/>
+          <w:bCs/>
+        </w:rPr>
+        <w:lastRenderedPageBreak/>
+        <w:t>Wide shot</w:t>
+      </w:r>
+      <w:r>
+        <w:t>: Facility entrance sign at sunset.</w:t>
+      </w:r>
+    </w:p>
+    <w:p>
+      <w:pPr>
+        <w:numPr>
+          <w:ilvl w:val="0"/>
+          <w:numId w:val="16"/>
+        </w:numPr>
+      </w:pPr>
+      <w:r>
+        <w:rPr>
+          <w:b/>
+          <w:bCs/>
+        </w:rPr>
+        <w:t>Staff group shot</w:t>
+      </w:r>
+      <w:r>
+        <w:t>: Team waving at the camera.</w:t>
+      </w:r>
+    </w:p>
+    <w:p>
+      <w:pPr>
+        <w:numPr>
+          <w:ilvl w:val="0"/>
+          <w:numId w:val="16"/>
+        </w:numPr>
+      </w:pPr>
+      <w:r>
+        <w:rPr>
+          <w:b/>
+          <w:bCs/>
+        </w:rPr>
+        <w:t>Overlay text</w:t>
+      </w:r>
+      <w:r>
+        <w:t xml:space="preserve">: </w:t>
+      </w:r>
+      <w:r>
+        <w:rPr>
+          <w:i/>
+          <w:iCs/>
+        </w:rPr>
+        <w:t>“Schedule a Tour | Call [Phone] | Visit [Website]”</w:t>
+      </w:r>
+      <w:r>
+        <w:t>.</w:t>
+      </w:r>
+    </w:p>
+    <w:p>
+      <w:r>
+        <w:pict w14:anchorId="41FC08FE">
+          <v:rect id="_x0000_i1135" style="width:0;height:1.5pt" o:hralign="center" o:hrstd="t" o:hr="t" fillcolor="#a0a0a0" stroked="f"/>
+        </w:pict>
+      </w:r>
+    </w:p>
+    <w:p>
+      <w:pPr>
+        <w:rPr>
+          <w:b/>
+          <w:bCs/>
+        </w:rPr>
+      </w:pPr>
+      <w:r>
+        <w:rPr>
+          <w:rFonts w:ascii="Segoe UI Emoji" w:hAnsi="Segoe UI Emoji" w:cs="Segoe UI Emoji"/>
+          <w:b/>
+          <w:bCs/>
+        </w:rPr>
+        <w:t>🎵</w:t>
+      </w:r>
+      <w:r>
+        <w:rPr>
+          <w:b/>
+          <w:bCs/>
+        </w:rPr>
+        <w:t xml:space="preserve"> Closing Scene (7:30 – 8:00)</w:t>
+      </w:r>
+    </w:p>
+    <w:p>
+      <w:r>
+        <w:rPr>
+          <w:b/>
+          <w:bCs/>
+        </w:rPr>
+        <w:t>Script focus</w:t>
+      </w:r>
+      <w:r>
+        <w:t>: Strong ending &amp; branding.</w:t>
+      </w:r>
+      <w:r>
+        <w:br/>
+      </w:r>
+      <w:r>
+        <w:rPr>
+          <w:b/>
+          <w:bCs/>
+        </w:rPr>
+        <w:t>Shots</w:t>
+      </w:r>
+      <w:r>
+        <w:t>:</w:t>
+      </w:r>
+    </w:p>
+    <w:p>
+      <w:pPr>
+        <w:numPr>
+          <w:ilvl w:val="0"/>
+          <w:numId w:val="17"/>
+        </w:numPr>
+      </w:pPr>
+      <w:r>
+        <w:rPr>
+          <w:b/>
+          <w:bCs/>
+        </w:rPr>
+        <w:t>Logo animation</w:t>
+      </w:r>
+      <w:r>
+        <w:t xml:space="preserve">: Facility logo with tagline </w:t>
+      </w:r>
+      <w:r>
+        <w:rPr>
+          <w:i/>
+          <w:iCs/>
+        </w:rPr>
+        <w:t>“Where Community and Care Come Together”</w:t>
+      </w:r>
+      <w:r>
+        <w:t>.</w:t>
+      </w:r>
+    </w:p>
+    <w:p>
+      <w:pPr>
+        <w:numPr>
+          <w:ilvl w:val="0"/>
+          <w:numId w:val="17"/>
+        </w:numPr>
+      </w:pPr>
+      <w:r>
+        <w:rPr>
+          <w:b/>
+          <w:bCs/>
+        </w:rPr>
+        <w:t>Background</w:t>
+      </w:r>
+      <w:r>
+        <w:t>: Gentle fade of the facility’s best visuals (e.g., happy resident moment).</w:t>
+      </w:r>
+    </w:p>
+    <w:p>
+      <w:pPr>
+        <w:numPr>
+          <w:ilvl w:val="0"/>
+          <w:numId w:val="17"/>
+        </w:numPr>
+      </w:pPr>
+      <w:r>
+        <w:rPr>
+          <w:b/>
+          <w:bCs/>
+        </w:rPr>
+        <w:t>Music</w:t>
+      </w:r>
+      <w:r>
+        <w:t>: Soft instrumental fade-out.</w:t>
+      </w:r>
+    </w:p>
+    <w:p>
+      <w:r>
+        <w:pict w14:anchorId="7CF1D242">
+          <v:rect id="_x0000_i1136" style="width:0;height:1.5pt" o:hralign="center" o:hrstd="t" o:hr="t" fillcolor="#a0a0a0" stroked="f"/>
+        </w:pict>
+      </w:r>
+    </w:p>
+    <w:p>
+      <w:r>
+        <w:rPr>
+          <w:rFonts w:ascii="Segoe UI Emoji" w:hAnsi="Segoe UI Emoji" w:cs="Segoe UI Emoji"/>
+        </w:rPr>
+        <w:t>✅</w:t>
+      </w:r>
+      <w:r>
+        <w:t xml:space="preserve"> </w:t>
+      </w:r>
+      <w:r>
+        <w:rPr>
+          <w:b/>
+          <w:bCs/>
+        </w:rPr>
+        <w:t>Tip for flexibility</w:t>
+      </w:r>
+      <w:r>
+        <w:t>: Keep each section modular. For facility-specific customizations, swap in different service visuals (e.g., if one facility doesn’t have hospice, emphasize rehab).</w:t>
       </w:r>
     </w:p>
     <w:p/>
@@ -113,6 +2143,2595 @@
     </w:sectPr>
   </w:body>
 </w:document>
+</file>
+
+<file path=word/numbering.xml><?xml version="1.0" encoding="utf-8"?>
+<w:numbering xmlns:wpc="http://schemas.microsoft.com/office/word/2010/wordprocessingCanvas" xmlns:cx="http://schemas.microsoft.com/office/drawing/2014/chartex" xmlns:cx1="http://schemas.microsoft.com/office/drawing/2015/9/8/chartex" xmlns:cx2="http://schemas.microsoft.com/office/drawing/2015/10/21/chartex" xmlns:cx3="http://schemas.microsoft.com/office/drawing/2016/5/9/chartex" xmlns:cx4="http://schemas.microsoft.com/office/drawing/2016/5/10/chartex" xmlns:cx5="http://schemas.microsoft.com/office/drawing/2016/5/11/chartex" xmlns:cx6="http://schemas.microsoft.com/office/drawing/2016/5/12/chartex" xmlns:cx7="http://schemas.microsoft.com/office/drawing/2016/5/13/chartex" xmlns:cx8="http://schemas.microsoft.com/office/drawing/2016/5/14/chartex" xmlns:mc="http://schemas.openxmlformats.org/markup-compatibility/2006" xmlns:aink="http://schemas.microsoft.com/office/drawing/2016/ink" xmlns:am3d="http://schemas.microsoft.com/office/drawing/2017/model3d" xmlns:o="urn:schemas-microsoft-com:office:office" xmlns:oel="http://schemas.microsoft.com/office/2019/extlst" xmlns:r="http://schemas.openxmlformats.org/officeDocument/2006/relationships" xmlns:m="http://schemas.openxmlformats.org/officeDocument/2006/math" xmlns:v="urn:schemas-microsoft-com:vml" xmlns:wp14="http://schemas.microsoft.com/office/word/2010/wordprocessingDrawing" xmlns:wp="http://schemas.openxmlformats.org/drawingml/2006/wordprocessingDrawing" xmlns:w10="urn:schemas-microsoft-com:office:word" xmlns:w="http://schemas.openxmlformats.org/wordprocessingml/2006/main" xmlns:w14="http://schemas.microsoft.com/office/word/2010/wordml" xmlns:w15="http://schemas.microsoft.com/office/word/2012/wordml" xmlns:w16cex="http://schemas.microsoft.com/office/word/2018/wordml/cex" xmlns:w16cid="http://schemas.microsoft.com/office/word/2016/wordml/cid" xmlns:w16="http://schemas.microsoft.com/office/word/2018/wordml" xmlns:w16du="http://schemas.microsoft.com/office/word/2023/wordml/word16du" xmlns:w16sdtdh="http://schemas.microsoft.com/office/word/2020/wordml/sdtdatahash" xmlns:w16sdtfl="http://schemas.microsoft.com/office/word/2024/wordml/sdtformatlock" xmlns:w16se="http://schemas.microsoft.com/office/word/2015/wordml/symex" xmlns:wpg="http://schemas.microsoft.com/office/word/2010/wordprocessingGroup" xmlns:wpi="http://schemas.microsoft.com/office/word/2010/wordprocessingInk" xmlns:wne="http://schemas.microsoft.com/office/word/2006/wordml" xmlns:wps="http://schemas.microsoft.com/office/word/2010/wordprocessingShape" mc:Ignorable="w14 w15 w16se w16cid w16 w16cex w16sdtdh w16sdtfl w16du wp14">
+  <w:abstractNum w:abstractNumId="0" w15:restartNumberingAfterBreak="0">
+    <w:nsid w:val="08BE008B"/>
+    <w:multiLevelType w:val="multilevel"/>
+    <w:tmpl w:val="EC9E30DE"/>
+    <w:lvl w:ilvl="0">
+      <w:start w:val="1"/>
+      <w:numFmt w:val="bullet"/>
+      <w:lvlText w:val=""/>
+      <w:lvlJc w:val="left"/>
+      <w:pPr>
+        <w:tabs>
+          <w:tab w:val="num" w:pos="720"/>
+        </w:tabs>
+        <w:ind w:left="720" w:hanging="360"/>
+      </w:pPr>
+      <w:rPr>
+        <w:rFonts w:ascii="Symbol" w:hAnsi="Symbol" w:hint="default"/>
+        <w:sz w:val="20"/>
+      </w:rPr>
+    </w:lvl>
+    <w:lvl w:ilvl="1" w:tentative="1">
+      <w:start w:val="1"/>
+      <w:numFmt w:val="bullet"/>
+      <w:lvlText w:val="o"/>
+      <w:lvlJc w:val="left"/>
+      <w:pPr>
+        <w:tabs>
+          <w:tab w:val="num" w:pos="1440"/>
+        </w:tabs>
+        <w:ind w:left="1440" w:hanging="360"/>
+      </w:pPr>
+      <w:rPr>
+        <w:rFonts w:ascii="Courier New" w:hAnsi="Courier New" w:hint="default"/>
+        <w:sz w:val="20"/>
+      </w:rPr>
+    </w:lvl>
+    <w:lvl w:ilvl="2" w:tentative="1">
+      <w:start w:val="1"/>
+      <w:numFmt w:val="bullet"/>
+      <w:lvlText w:val=""/>
+      <w:lvlJc w:val="left"/>
+      <w:pPr>
+        <w:tabs>
+          <w:tab w:val="num" w:pos="2160"/>
+        </w:tabs>
+        <w:ind w:left="2160" w:hanging="360"/>
+      </w:pPr>
+      <w:rPr>
+        <w:rFonts w:ascii="Wingdings" w:hAnsi="Wingdings" w:hint="default"/>
+        <w:sz w:val="20"/>
+      </w:rPr>
+    </w:lvl>
+    <w:lvl w:ilvl="3" w:tentative="1">
+      <w:start w:val="1"/>
+      <w:numFmt w:val="bullet"/>
+      <w:lvlText w:val=""/>
+      <w:lvlJc w:val="left"/>
+      <w:pPr>
+        <w:tabs>
+          <w:tab w:val="num" w:pos="2880"/>
+        </w:tabs>
+        <w:ind w:left="2880" w:hanging="360"/>
+      </w:pPr>
+      <w:rPr>
+        <w:rFonts w:ascii="Wingdings" w:hAnsi="Wingdings" w:hint="default"/>
+        <w:sz w:val="20"/>
+      </w:rPr>
+    </w:lvl>
+    <w:lvl w:ilvl="4" w:tentative="1">
+      <w:start w:val="1"/>
+      <w:numFmt w:val="bullet"/>
+      <w:lvlText w:val=""/>
+      <w:lvlJc w:val="left"/>
+      <w:pPr>
+        <w:tabs>
+          <w:tab w:val="num" w:pos="3600"/>
+        </w:tabs>
+        <w:ind w:left="3600" w:hanging="360"/>
+      </w:pPr>
+      <w:rPr>
+        <w:rFonts w:ascii="Wingdings" w:hAnsi="Wingdings" w:hint="default"/>
+        <w:sz w:val="20"/>
+      </w:rPr>
+    </w:lvl>
+    <w:lvl w:ilvl="5" w:tentative="1">
+      <w:start w:val="1"/>
+      <w:numFmt w:val="bullet"/>
+      <w:lvlText w:val=""/>
+      <w:lvlJc w:val="left"/>
+      <w:pPr>
+        <w:tabs>
+          <w:tab w:val="num" w:pos="4320"/>
+        </w:tabs>
+        <w:ind w:left="4320" w:hanging="360"/>
+      </w:pPr>
+      <w:rPr>
+        <w:rFonts w:ascii="Wingdings" w:hAnsi="Wingdings" w:hint="default"/>
+        <w:sz w:val="20"/>
+      </w:rPr>
+    </w:lvl>
+    <w:lvl w:ilvl="6" w:tentative="1">
+      <w:start w:val="1"/>
+      <w:numFmt w:val="bullet"/>
+      <w:lvlText w:val=""/>
+      <w:lvlJc w:val="left"/>
+      <w:pPr>
+        <w:tabs>
+          <w:tab w:val="num" w:pos="5040"/>
+        </w:tabs>
+        <w:ind w:left="5040" w:hanging="360"/>
+      </w:pPr>
+      <w:rPr>
+        <w:rFonts w:ascii="Wingdings" w:hAnsi="Wingdings" w:hint="default"/>
+        <w:sz w:val="20"/>
+      </w:rPr>
+    </w:lvl>
+    <w:lvl w:ilvl="7" w:tentative="1">
+      <w:start w:val="1"/>
+      <w:numFmt w:val="bullet"/>
+      <w:lvlText w:val=""/>
+      <w:lvlJc w:val="left"/>
+      <w:pPr>
+        <w:tabs>
+          <w:tab w:val="num" w:pos="5760"/>
+        </w:tabs>
+        <w:ind w:left="5760" w:hanging="360"/>
+      </w:pPr>
+      <w:rPr>
+        <w:rFonts w:ascii="Wingdings" w:hAnsi="Wingdings" w:hint="default"/>
+        <w:sz w:val="20"/>
+      </w:rPr>
+    </w:lvl>
+    <w:lvl w:ilvl="8" w:tentative="1">
+      <w:start w:val="1"/>
+      <w:numFmt w:val="bullet"/>
+      <w:lvlText w:val=""/>
+      <w:lvlJc w:val="left"/>
+      <w:pPr>
+        <w:tabs>
+          <w:tab w:val="num" w:pos="6480"/>
+        </w:tabs>
+        <w:ind w:left="6480" w:hanging="360"/>
+      </w:pPr>
+      <w:rPr>
+        <w:rFonts w:ascii="Wingdings" w:hAnsi="Wingdings" w:hint="default"/>
+        <w:sz w:val="20"/>
+      </w:rPr>
+    </w:lvl>
+  </w:abstractNum>
+  <w:abstractNum w:abstractNumId="1" w15:restartNumberingAfterBreak="0">
+    <w:nsid w:val="16AA2D69"/>
+    <w:multiLevelType w:val="multilevel"/>
+    <w:tmpl w:val="B05C3564"/>
+    <w:lvl w:ilvl="0">
+      <w:start w:val="1"/>
+      <w:numFmt w:val="bullet"/>
+      <w:lvlText w:val=""/>
+      <w:lvlJc w:val="left"/>
+      <w:pPr>
+        <w:tabs>
+          <w:tab w:val="num" w:pos="720"/>
+        </w:tabs>
+        <w:ind w:left="720" w:hanging="360"/>
+      </w:pPr>
+      <w:rPr>
+        <w:rFonts w:ascii="Symbol" w:hAnsi="Symbol" w:hint="default"/>
+        <w:sz w:val="20"/>
+      </w:rPr>
+    </w:lvl>
+    <w:lvl w:ilvl="1" w:tentative="1">
+      <w:start w:val="1"/>
+      <w:numFmt w:val="bullet"/>
+      <w:lvlText w:val="o"/>
+      <w:lvlJc w:val="left"/>
+      <w:pPr>
+        <w:tabs>
+          <w:tab w:val="num" w:pos="1440"/>
+        </w:tabs>
+        <w:ind w:left="1440" w:hanging="360"/>
+      </w:pPr>
+      <w:rPr>
+        <w:rFonts w:ascii="Courier New" w:hAnsi="Courier New" w:hint="default"/>
+        <w:sz w:val="20"/>
+      </w:rPr>
+    </w:lvl>
+    <w:lvl w:ilvl="2" w:tentative="1">
+      <w:start w:val="1"/>
+      <w:numFmt w:val="bullet"/>
+      <w:lvlText w:val=""/>
+      <w:lvlJc w:val="left"/>
+      <w:pPr>
+        <w:tabs>
+          <w:tab w:val="num" w:pos="2160"/>
+        </w:tabs>
+        <w:ind w:left="2160" w:hanging="360"/>
+      </w:pPr>
+      <w:rPr>
+        <w:rFonts w:ascii="Wingdings" w:hAnsi="Wingdings" w:hint="default"/>
+        <w:sz w:val="20"/>
+      </w:rPr>
+    </w:lvl>
+    <w:lvl w:ilvl="3" w:tentative="1">
+      <w:start w:val="1"/>
+      <w:numFmt w:val="bullet"/>
+      <w:lvlText w:val=""/>
+      <w:lvlJc w:val="left"/>
+      <w:pPr>
+        <w:tabs>
+          <w:tab w:val="num" w:pos="2880"/>
+        </w:tabs>
+        <w:ind w:left="2880" w:hanging="360"/>
+      </w:pPr>
+      <w:rPr>
+        <w:rFonts w:ascii="Wingdings" w:hAnsi="Wingdings" w:hint="default"/>
+        <w:sz w:val="20"/>
+      </w:rPr>
+    </w:lvl>
+    <w:lvl w:ilvl="4" w:tentative="1">
+      <w:start w:val="1"/>
+      <w:numFmt w:val="bullet"/>
+      <w:lvlText w:val=""/>
+      <w:lvlJc w:val="left"/>
+      <w:pPr>
+        <w:tabs>
+          <w:tab w:val="num" w:pos="3600"/>
+        </w:tabs>
+        <w:ind w:left="3600" w:hanging="360"/>
+      </w:pPr>
+      <w:rPr>
+        <w:rFonts w:ascii="Wingdings" w:hAnsi="Wingdings" w:hint="default"/>
+        <w:sz w:val="20"/>
+      </w:rPr>
+    </w:lvl>
+    <w:lvl w:ilvl="5" w:tentative="1">
+      <w:start w:val="1"/>
+      <w:numFmt w:val="bullet"/>
+      <w:lvlText w:val=""/>
+      <w:lvlJc w:val="left"/>
+      <w:pPr>
+        <w:tabs>
+          <w:tab w:val="num" w:pos="4320"/>
+        </w:tabs>
+        <w:ind w:left="4320" w:hanging="360"/>
+      </w:pPr>
+      <w:rPr>
+        <w:rFonts w:ascii="Wingdings" w:hAnsi="Wingdings" w:hint="default"/>
+        <w:sz w:val="20"/>
+      </w:rPr>
+    </w:lvl>
+    <w:lvl w:ilvl="6" w:tentative="1">
+      <w:start w:val="1"/>
+      <w:numFmt w:val="bullet"/>
+      <w:lvlText w:val=""/>
+      <w:lvlJc w:val="left"/>
+      <w:pPr>
+        <w:tabs>
+          <w:tab w:val="num" w:pos="5040"/>
+        </w:tabs>
+        <w:ind w:left="5040" w:hanging="360"/>
+      </w:pPr>
+      <w:rPr>
+        <w:rFonts w:ascii="Wingdings" w:hAnsi="Wingdings" w:hint="default"/>
+        <w:sz w:val="20"/>
+      </w:rPr>
+    </w:lvl>
+    <w:lvl w:ilvl="7" w:tentative="1">
+      <w:start w:val="1"/>
+      <w:numFmt w:val="bullet"/>
+      <w:lvlText w:val=""/>
+      <w:lvlJc w:val="left"/>
+      <w:pPr>
+        <w:tabs>
+          <w:tab w:val="num" w:pos="5760"/>
+        </w:tabs>
+        <w:ind w:left="5760" w:hanging="360"/>
+      </w:pPr>
+      <w:rPr>
+        <w:rFonts w:ascii="Wingdings" w:hAnsi="Wingdings" w:hint="default"/>
+        <w:sz w:val="20"/>
+      </w:rPr>
+    </w:lvl>
+    <w:lvl w:ilvl="8" w:tentative="1">
+      <w:start w:val="1"/>
+      <w:numFmt w:val="bullet"/>
+      <w:lvlText w:val=""/>
+      <w:lvlJc w:val="left"/>
+      <w:pPr>
+        <w:tabs>
+          <w:tab w:val="num" w:pos="6480"/>
+        </w:tabs>
+        <w:ind w:left="6480" w:hanging="360"/>
+      </w:pPr>
+      <w:rPr>
+        <w:rFonts w:ascii="Wingdings" w:hAnsi="Wingdings" w:hint="default"/>
+        <w:sz w:val="20"/>
+      </w:rPr>
+    </w:lvl>
+  </w:abstractNum>
+  <w:abstractNum w:abstractNumId="2" w15:restartNumberingAfterBreak="0">
+    <w:nsid w:val="1F122A19"/>
+    <w:multiLevelType w:val="multilevel"/>
+    <w:tmpl w:val="7EB6ADE6"/>
+    <w:lvl w:ilvl="0">
+      <w:start w:val="1"/>
+      <w:numFmt w:val="bullet"/>
+      <w:lvlText w:val=""/>
+      <w:lvlJc w:val="left"/>
+      <w:pPr>
+        <w:tabs>
+          <w:tab w:val="num" w:pos="720"/>
+        </w:tabs>
+        <w:ind w:left="720" w:hanging="360"/>
+      </w:pPr>
+      <w:rPr>
+        <w:rFonts w:ascii="Symbol" w:hAnsi="Symbol" w:hint="default"/>
+        <w:sz w:val="20"/>
+      </w:rPr>
+    </w:lvl>
+    <w:lvl w:ilvl="1" w:tentative="1">
+      <w:start w:val="1"/>
+      <w:numFmt w:val="bullet"/>
+      <w:lvlText w:val="o"/>
+      <w:lvlJc w:val="left"/>
+      <w:pPr>
+        <w:tabs>
+          <w:tab w:val="num" w:pos="1440"/>
+        </w:tabs>
+        <w:ind w:left="1440" w:hanging="360"/>
+      </w:pPr>
+      <w:rPr>
+        <w:rFonts w:ascii="Courier New" w:hAnsi="Courier New" w:hint="default"/>
+        <w:sz w:val="20"/>
+      </w:rPr>
+    </w:lvl>
+    <w:lvl w:ilvl="2" w:tentative="1">
+      <w:start w:val="1"/>
+      <w:numFmt w:val="bullet"/>
+      <w:lvlText w:val=""/>
+      <w:lvlJc w:val="left"/>
+      <w:pPr>
+        <w:tabs>
+          <w:tab w:val="num" w:pos="2160"/>
+        </w:tabs>
+        <w:ind w:left="2160" w:hanging="360"/>
+      </w:pPr>
+      <w:rPr>
+        <w:rFonts w:ascii="Wingdings" w:hAnsi="Wingdings" w:hint="default"/>
+        <w:sz w:val="20"/>
+      </w:rPr>
+    </w:lvl>
+    <w:lvl w:ilvl="3" w:tentative="1">
+      <w:start w:val="1"/>
+      <w:numFmt w:val="bullet"/>
+      <w:lvlText w:val=""/>
+      <w:lvlJc w:val="left"/>
+      <w:pPr>
+        <w:tabs>
+          <w:tab w:val="num" w:pos="2880"/>
+        </w:tabs>
+        <w:ind w:left="2880" w:hanging="360"/>
+      </w:pPr>
+      <w:rPr>
+        <w:rFonts w:ascii="Wingdings" w:hAnsi="Wingdings" w:hint="default"/>
+        <w:sz w:val="20"/>
+      </w:rPr>
+    </w:lvl>
+    <w:lvl w:ilvl="4" w:tentative="1">
+      <w:start w:val="1"/>
+      <w:numFmt w:val="bullet"/>
+      <w:lvlText w:val=""/>
+      <w:lvlJc w:val="left"/>
+      <w:pPr>
+        <w:tabs>
+          <w:tab w:val="num" w:pos="3600"/>
+        </w:tabs>
+        <w:ind w:left="3600" w:hanging="360"/>
+      </w:pPr>
+      <w:rPr>
+        <w:rFonts w:ascii="Wingdings" w:hAnsi="Wingdings" w:hint="default"/>
+        <w:sz w:val="20"/>
+      </w:rPr>
+    </w:lvl>
+    <w:lvl w:ilvl="5" w:tentative="1">
+      <w:start w:val="1"/>
+      <w:numFmt w:val="bullet"/>
+      <w:lvlText w:val=""/>
+      <w:lvlJc w:val="left"/>
+      <w:pPr>
+        <w:tabs>
+          <w:tab w:val="num" w:pos="4320"/>
+        </w:tabs>
+        <w:ind w:left="4320" w:hanging="360"/>
+      </w:pPr>
+      <w:rPr>
+        <w:rFonts w:ascii="Wingdings" w:hAnsi="Wingdings" w:hint="default"/>
+        <w:sz w:val="20"/>
+      </w:rPr>
+    </w:lvl>
+    <w:lvl w:ilvl="6" w:tentative="1">
+      <w:start w:val="1"/>
+      <w:numFmt w:val="bullet"/>
+      <w:lvlText w:val=""/>
+      <w:lvlJc w:val="left"/>
+      <w:pPr>
+        <w:tabs>
+          <w:tab w:val="num" w:pos="5040"/>
+        </w:tabs>
+        <w:ind w:left="5040" w:hanging="360"/>
+      </w:pPr>
+      <w:rPr>
+        <w:rFonts w:ascii="Wingdings" w:hAnsi="Wingdings" w:hint="default"/>
+        <w:sz w:val="20"/>
+      </w:rPr>
+    </w:lvl>
+    <w:lvl w:ilvl="7" w:tentative="1">
+      <w:start w:val="1"/>
+      <w:numFmt w:val="bullet"/>
+      <w:lvlText w:val=""/>
+      <w:lvlJc w:val="left"/>
+      <w:pPr>
+        <w:tabs>
+          <w:tab w:val="num" w:pos="5760"/>
+        </w:tabs>
+        <w:ind w:left="5760" w:hanging="360"/>
+      </w:pPr>
+      <w:rPr>
+        <w:rFonts w:ascii="Wingdings" w:hAnsi="Wingdings" w:hint="default"/>
+        <w:sz w:val="20"/>
+      </w:rPr>
+    </w:lvl>
+    <w:lvl w:ilvl="8" w:tentative="1">
+      <w:start w:val="1"/>
+      <w:numFmt w:val="bullet"/>
+      <w:lvlText w:val=""/>
+      <w:lvlJc w:val="left"/>
+      <w:pPr>
+        <w:tabs>
+          <w:tab w:val="num" w:pos="6480"/>
+        </w:tabs>
+        <w:ind w:left="6480" w:hanging="360"/>
+      </w:pPr>
+      <w:rPr>
+        <w:rFonts w:ascii="Wingdings" w:hAnsi="Wingdings" w:hint="default"/>
+        <w:sz w:val="20"/>
+      </w:rPr>
+    </w:lvl>
+  </w:abstractNum>
+  <w:abstractNum w:abstractNumId="3" w15:restartNumberingAfterBreak="0">
+    <w:nsid w:val="22F96184"/>
+    <w:multiLevelType w:val="multilevel"/>
+    <w:tmpl w:val="A33EFA4A"/>
+    <w:lvl w:ilvl="0">
+      <w:start w:val="1"/>
+      <w:numFmt w:val="bullet"/>
+      <w:lvlText w:val=""/>
+      <w:lvlJc w:val="left"/>
+      <w:pPr>
+        <w:tabs>
+          <w:tab w:val="num" w:pos="720"/>
+        </w:tabs>
+        <w:ind w:left="720" w:hanging="360"/>
+      </w:pPr>
+      <w:rPr>
+        <w:rFonts w:ascii="Symbol" w:hAnsi="Symbol" w:hint="default"/>
+        <w:sz w:val="20"/>
+      </w:rPr>
+    </w:lvl>
+    <w:lvl w:ilvl="1" w:tentative="1">
+      <w:start w:val="1"/>
+      <w:numFmt w:val="bullet"/>
+      <w:lvlText w:val="o"/>
+      <w:lvlJc w:val="left"/>
+      <w:pPr>
+        <w:tabs>
+          <w:tab w:val="num" w:pos="1440"/>
+        </w:tabs>
+        <w:ind w:left="1440" w:hanging="360"/>
+      </w:pPr>
+      <w:rPr>
+        <w:rFonts w:ascii="Courier New" w:hAnsi="Courier New" w:hint="default"/>
+        <w:sz w:val="20"/>
+      </w:rPr>
+    </w:lvl>
+    <w:lvl w:ilvl="2" w:tentative="1">
+      <w:start w:val="1"/>
+      <w:numFmt w:val="bullet"/>
+      <w:lvlText w:val=""/>
+      <w:lvlJc w:val="left"/>
+      <w:pPr>
+        <w:tabs>
+          <w:tab w:val="num" w:pos="2160"/>
+        </w:tabs>
+        <w:ind w:left="2160" w:hanging="360"/>
+      </w:pPr>
+      <w:rPr>
+        <w:rFonts w:ascii="Wingdings" w:hAnsi="Wingdings" w:hint="default"/>
+        <w:sz w:val="20"/>
+      </w:rPr>
+    </w:lvl>
+    <w:lvl w:ilvl="3" w:tentative="1">
+      <w:start w:val="1"/>
+      <w:numFmt w:val="bullet"/>
+      <w:lvlText w:val=""/>
+      <w:lvlJc w:val="left"/>
+      <w:pPr>
+        <w:tabs>
+          <w:tab w:val="num" w:pos="2880"/>
+        </w:tabs>
+        <w:ind w:left="2880" w:hanging="360"/>
+      </w:pPr>
+      <w:rPr>
+        <w:rFonts w:ascii="Wingdings" w:hAnsi="Wingdings" w:hint="default"/>
+        <w:sz w:val="20"/>
+      </w:rPr>
+    </w:lvl>
+    <w:lvl w:ilvl="4" w:tentative="1">
+      <w:start w:val="1"/>
+      <w:numFmt w:val="bullet"/>
+      <w:lvlText w:val=""/>
+      <w:lvlJc w:val="left"/>
+      <w:pPr>
+        <w:tabs>
+          <w:tab w:val="num" w:pos="3600"/>
+        </w:tabs>
+        <w:ind w:left="3600" w:hanging="360"/>
+      </w:pPr>
+      <w:rPr>
+        <w:rFonts w:ascii="Wingdings" w:hAnsi="Wingdings" w:hint="default"/>
+        <w:sz w:val="20"/>
+      </w:rPr>
+    </w:lvl>
+    <w:lvl w:ilvl="5" w:tentative="1">
+      <w:start w:val="1"/>
+      <w:numFmt w:val="bullet"/>
+      <w:lvlText w:val=""/>
+      <w:lvlJc w:val="left"/>
+      <w:pPr>
+        <w:tabs>
+          <w:tab w:val="num" w:pos="4320"/>
+        </w:tabs>
+        <w:ind w:left="4320" w:hanging="360"/>
+      </w:pPr>
+      <w:rPr>
+        <w:rFonts w:ascii="Wingdings" w:hAnsi="Wingdings" w:hint="default"/>
+        <w:sz w:val="20"/>
+      </w:rPr>
+    </w:lvl>
+    <w:lvl w:ilvl="6" w:tentative="1">
+      <w:start w:val="1"/>
+      <w:numFmt w:val="bullet"/>
+      <w:lvlText w:val=""/>
+      <w:lvlJc w:val="left"/>
+      <w:pPr>
+        <w:tabs>
+          <w:tab w:val="num" w:pos="5040"/>
+        </w:tabs>
+        <w:ind w:left="5040" w:hanging="360"/>
+      </w:pPr>
+      <w:rPr>
+        <w:rFonts w:ascii="Wingdings" w:hAnsi="Wingdings" w:hint="default"/>
+        <w:sz w:val="20"/>
+      </w:rPr>
+    </w:lvl>
+    <w:lvl w:ilvl="7" w:tentative="1">
+      <w:start w:val="1"/>
+      <w:numFmt w:val="bullet"/>
+      <w:lvlText w:val=""/>
+      <w:lvlJc w:val="left"/>
+      <w:pPr>
+        <w:tabs>
+          <w:tab w:val="num" w:pos="5760"/>
+        </w:tabs>
+        <w:ind w:left="5760" w:hanging="360"/>
+      </w:pPr>
+      <w:rPr>
+        <w:rFonts w:ascii="Wingdings" w:hAnsi="Wingdings" w:hint="default"/>
+        <w:sz w:val="20"/>
+      </w:rPr>
+    </w:lvl>
+    <w:lvl w:ilvl="8" w:tentative="1">
+      <w:start w:val="1"/>
+      <w:numFmt w:val="bullet"/>
+      <w:lvlText w:val=""/>
+      <w:lvlJc w:val="left"/>
+      <w:pPr>
+        <w:tabs>
+          <w:tab w:val="num" w:pos="6480"/>
+        </w:tabs>
+        <w:ind w:left="6480" w:hanging="360"/>
+      </w:pPr>
+      <w:rPr>
+        <w:rFonts w:ascii="Wingdings" w:hAnsi="Wingdings" w:hint="default"/>
+        <w:sz w:val="20"/>
+      </w:rPr>
+    </w:lvl>
+  </w:abstractNum>
+  <w:abstractNum w:abstractNumId="4" w15:restartNumberingAfterBreak="0">
+    <w:nsid w:val="23B17C56"/>
+    <w:multiLevelType w:val="multilevel"/>
+    <w:tmpl w:val="A7285836"/>
+    <w:lvl w:ilvl="0">
+      <w:start w:val="1"/>
+      <w:numFmt w:val="bullet"/>
+      <w:lvlText w:val=""/>
+      <w:lvlJc w:val="left"/>
+      <w:pPr>
+        <w:tabs>
+          <w:tab w:val="num" w:pos="720"/>
+        </w:tabs>
+        <w:ind w:left="720" w:hanging="360"/>
+      </w:pPr>
+      <w:rPr>
+        <w:rFonts w:ascii="Symbol" w:hAnsi="Symbol" w:hint="default"/>
+        <w:sz w:val="20"/>
+      </w:rPr>
+    </w:lvl>
+    <w:lvl w:ilvl="1" w:tentative="1">
+      <w:start w:val="1"/>
+      <w:numFmt w:val="bullet"/>
+      <w:lvlText w:val="o"/>
+      <w:lvlJc w:val="left"/>
+      <w:pPr>
+        <w:tabs>
+          <w:tab w:val="num" w:pos="1440"/>
+        </w:tabs>
+        <w:ind w:left="1440" w:hanging="360"/>
+      </w:pPr>
+      <w:rPr>
+        <w:rFonts w:ascii="Courier New" w:hAnsi="Courier New" w:hint="default"/>
+        <w:sz w:val="20"/>
+      </w:rPr>
+    </w:lvl>
+    <w:lvl w:ilvl="2" w:tentative="1">
+      <w:start w:val="1"/>
+      <w:numFmt w:val="bullet"/>
+      <w:lvlText w:val=""/>
+      <w:lvlJc w:val="left"/>
+      <w:pPr>
+        <w:tabs>
+          <w:tab w:val="num" w:pos="2160"/>
+        </w:tabs>
+        <w:ind w:left="2160" w:hanging="360"/>
+      </w:pPr>
+      <w:rPr>
+        <w:rFonts w:ascii="Wingdings" w:hAnsi="Wingdings" w:hint="default"/>
+        <w:sz w:val="20"/>
+      </w:rPr>
+    </w:lvl>
+    <w:lvl w:ilvl="3" w:tentative="1">
+      <w:start w:val="1"/>
+      <w:numFmt w:val="bullet"/>
+      <w:lvlText w:val=""/>
+      <w:lvlJc w:val="left"/>
+      <w:pPr>
+        <w:tabs>
+          <w:tab w:val="num" w:pos="2880"/>
+        </w:tabs>
+        <w:ind w:left="2880" w:hanging="360"/>
+      </w:pPr>
+      <w:rPr>
+        <w:rFonts w:ascii="Wingdings" w:hAnsi="Wingdings" w:hint="default"/>
+        <w:sz w:val="20"/>
+      </w:rPr>
+    </w:lvl>
+    <w:lvl w:ilvl="4" w:tentative="1">
+      <w:start w:val="1"/>
+      <w:numFmt w:val="bullet"/>
+      <w:lvlText w:val=""/>
+      <w:lvlJc w:val="left"/>
+      <w:pPr>
+        <w:tabs>
+          <w:tab w:val="num" w:pos="3600"/>
+        </w:tabs>
+        <w:ind w:left="3600" w:hanging="360"/>
+      </w:pPr>
+      <w:rPr>
+        <w:rFonts w:ascii="Wingdings" w:hAnsi="Wingdings" w:hint="default"/>
+        <w:sz w:val="20"/>
+      </w:rPr>
+    </w:lvl>
+    <w:lvl w:ilvl="5" w:tentative="1">
+      <w:start w:val="1"/>
+      <w:numFmt w:val="bullet"/>
+      <w:lvlText w:val=""/>
+      <w:lvlJc w:val="left"/>
+      <w:pPr>
+        <w:tabs>
+          <w:tab w:val="num" w:pos="4320"/>
+        </w:tabs>
+        <w:ind w:left="4320" w:hanging="360"/>
+      </w:pPr>
+      <w:rPr>
+        <w:rFonts w:ascii="Wingdings" w:hAnsi="Wingdings" w:hint="default"/>
+        <w:sz w:val="20"/>
+      </w:rPr>
+    </w:lvl>
+    <w:lvl w:ilvl="6" w:tentative="1">
+      <w:start w:val="1"/>
+      <w:numFmt w:val="bullet"/>
+      <w:lvlText w:val=""/>
+      <w:lvlJc w:val="left"/>
+      <w:pPr>
+        <w:tabs>
+          <w:tab w:val="num" w:pos="5040"/>
+        </w:tabs>
+        <w:ind w:left="5040" w:hanging="360"/>
+      </w:pPr>
+      <w:rPr>
+        <w:rFonts w:ascii="Wingdings" w:hAnsi="Wingdings" w:hint="default"/>
+        <w:sz w:val="20"/>
+      </w:rPr>
+    </w:lvl>
+    <w:lvl w:ilvl="7" w:tentative="1">
+      <w:start w:val="1"/>
+      <w:numFmt w:val="bullet"/>
+      <w:lvlText w:val=""/>
+      <w:lvlJc w:val="left"/>
+      <w:pPr>
+        <w:tabs>
+          <w:tab w:val="num" w:pos="5760"/>
+        </w:tabs>
+        <w:ind w:left="5760" w:hanging="360"/>
+      </w:pPr>
+      <w:rPr>
+        <w:rFonts w:ascii="Wingdings" w:hAnsi="Wingdings" w:hint="default"/>
+        <w:sz w:val="20"/>
+      </w:rPr>
+    </w:lvl>
+    <w:lvl w:ilvl="8" w:tentative="1">
+      <w:start w:val="1"/>
+      <w:numFmt w:val="bullet"/>
+      <w:lvlText w:val=""/>
+      <w:lvlJc w:val="left"/>
+      <w:pPr>
+        <w:tabs>
+          <w:tab w:val="num" w:pos="6480"/>
+        </w:tabs>
+        <w:ind w:left="6480" w:hanging="360"/>
+      </w:pPr>
+      <w:rPr>
+        <w:rFonts w:ascii="Wingdings" w:hAnsi="Wingdings" w:hint="default"/>
+        <w:sz w:val="20"/>
+      </w:rPr>
+    </w:lvl>
+  </w:abstractNum>
+  <w:abstractNum w:abstractNumId="5" w15:restartNumberingAfterBreak="0">
+    <w:nsid w:val="2C06213C"/>
+    <w:multiLevelType w:val="multilevel"/>
+    <w:tmpl w:val="4A82BD32"/>
+    <w:lvl w:ilvl="0">
+      <w:start w:val="1"/>
+      <w:numFmt w:val="bullet"/>
+      <w:lvlText w:val=""/>
+      <w:lvlJc w:val="left"/>
+      <w:pPr>
+        <w:tabs>
+          <w:tab w:val="num" w:pos="720"/>
+        </w:tabs>
+        <w:ind w:left="720" w:hanging="360"/>
+      </w:pPr>
+      <w:rPr>
+        <w:rFonts w:ascii="Symbol" w:hAnsi="Symbol" w:hint="default"/>
+        <w:sz w:val="20"/>
+      </w:rPr>
+    </w:lvl>
+    <w:lvl w:ilvl="1" w:tentative="1">
+      <w:start w:val="1"/>
+      <w:numFmt w:val="bullet"/>
+      <w:lvlText w:val="o"/>
+      <w:lvlJc w:val="left"/>
+      <w:pPr>
+        <w:tabs>
+          <w:tab w:val="num" w:pos="1440"/>
+        </w:tabs>
+        <w:ind w:left="1440" w:hanging="360"/>
+      </w:pPr>
+      <w:rPr>
+        <w:rFonts w:ascii="Courier New" w:hAnsi="Courier New" w:hint="default"/>
+        <w:sz w:val="20"/>
+      </w:rPr>
+    </w:lvl>
+    <w:lvl w:ilvl="2" w:tentative="1">
+      <w:start w:val="1"/>
+      <w:numFmt w:val="bullet"/>
+      <w:lvlText w:val=""/>
+      <w:lvlJc w:val="left"/>
+      <w:pPr>
+        <w:tabs>
+          <w:tab w:val="num" w:pos="2160"/>
+        </w:tabs>
+        <w:ind w:left="2160" w:hanging="360"/>
+      </w:pPr>
+      <w:rPr>
+        <w:rFonts w:ascii="Wingdings" w:hAnsi="Wingdings" w:hint="default"/>
+        <w:sz w:val="20"/>
+      </w:rPr>
+    </w:lvl>
+    <w:lvl w:ilvl="3" w:tentative="1">
+      <w:start w:val="1"/>
+      <w:numFmt w:val="bullet"/>
+      <w:lvlText w:val=""/>
+      <w:lvlJc w:val="left"/>
+      <w:pPr>
+        <w:tabs>
+          <w:tab w:val="num" w:pos="2880"/>
+        </w:tabs>
+        <w:ind w:left="2880" w:hanging="360"/>
+      </w:pPr>
+      <w:rPr>
+        <w:rFonts w:ascii="Wingdings" w:hAnsi="Wingdings" w:hint="default"/>
+        <w:sz w:val="20"/>
+      </w:rPr>
+    </w:lvl>
+    <w:lvl w:ilvl="4" w:tentative="1">
+      <w:start w:val="1"/>
+      <w:numFmt w:val="bullet"/>
+      <w:lvlText w:val=""/>
+      <w:lvlJc w:val="left"/>
+      <w:pPr>
+        <w:tabs>
+          <w:tab w:val="num" w:pos="3600"/>
+        </w:tabs>
+        <w:ind w:left="3600" w:hanging="360"/>
+      </w:pPr>
+      <w:rPr>
+        <w:rFonts w:ascii="Wingdings" w:hAnsi="Wingdings" w:hint="default"/>
+        <w:sz w:val="20"/>
+      </w:rPr>
+    </w:lvl>
+    <w:lvl w:ilvl="5" w:tentative="1">
+      <w:start w:val="1"/>
+      <w:numFmt w:val="bullet"/>
+      <w:lvlText w:val=""/>
+      <w:lvlJc w:val="left"/>
+      <w:pPr>
+        <w:tabs>
+          <w:tab w:val="num" w:pos="4320"/>
+        </w:tabs>
+        <w:ind w:left="4320" w:hanging="360"/>
+      </w:pPr>
+      <w:rPr>
+        <w:rFonts w:ascii="Wingdings" w:hAnsi="Wingdings" w:hint="default"/>
+        <w:sz w:val="20"/>
+      </w:rPr>
+    </w:lvl>
+    <w:lvl w:ilvl="6" w:tentative="1">
+      <w:start w:val="1"/>
+      <w:numFmt w:val="bullet"/>
+      <w:lvlText w:val=""/>
+      <w:lvlJc w:val="left"/>
+      <w:pPr>
+        <w:tabs>
+          <w:tab w:val="num" w:pos="5040"/>
+        </w:tabs>
+        <w:ind w:left="5040" w:hanging="360"/>
+      </w:pPr>
+      <w:rPr>
+        <w:rFonts w:ascii="Wingdings" w:hAnsi="Wingdings" w:hint="default"/>
+        <w:sz w:val="20"/>
+      </w:rPr>
+    </w:lvl>
+    <w:lvl w:ilvl="7" w:tentative="1">
+      <w:start w:val="1"/>
+      <w:numFmt w:val="bullet"/>
+      <w:lvlText w:val=""/>
+      <w:lvlJc w:val="left"/>
+      <w:pPr>
+        <w:tabs>
+          <w:tab w:val="num" w:pos="5760"/>
+        </w:tabs>
+        <w:ind w:left="5760" w:hanging="360"/>
+      </w:pPr>
+      <w:rPr>
+        <w:rFonts w:ascii="Wingdings" w:hAnsi="Wingdings" w:hint="default"/>
+        <w:sz w:val="20"/>
+      </w:rPr>
+    </w:lvl>
+    <w:lvl w:ilvl="8" w:tentative="1">
+      <w:start w:val="1"/>
+      <w:numFmt w:val="bullet"/>
+      <w:lvlText w:val=""/>
+      <w:lvlJc w:val="left"/>
+      <w:pPr>
+        <w:tabs>
+          <w:tab w:val="num" w:pos="6480"/>
+        </w:tabs>
+        <w:ind w:left="6480" w:hanging="360"/>
+      </w:pPr>
+      <w:rPr>
+        <w:rFonts w:ascii="Wingdings" w:hAnsi="Wingdings" w:hint="default"/>
+        <w:sz w:val="20"/>
+      </w:rPr>
+    </w:lvl>
+  </w:abstractNum>
+  <w:abstractNum w:abstractNumId="6" w15:restartNumberingAfterBreak="0">
+    <w:nsid w:val="315951A4"/>
+    <w:multiLevelType w:val="multilevel"/>
+    <w:tmpl w:val="77405FE8"/>
+    <w:lvl w:ilvl="0">
+      <w:start w:val="1"/>
+      <w:numFmt w:val="bullet"/>
+      <w:lvlText w:val=""/>
+      <w:lvlJc w:val="left"/>
+      <w:pPr>
+        <w:tabs>
+          <w:tab w:val="num" w:pos="720"/>
+        </w:tabs>
+        <w:ind w:left="720" w:hanging="360"/>
+      </w:pPr>
+      <w:rPr>
+        <w:rFonts w:ascii="Symbol" w:hAnsi="Symbol" w:hint="default"/>
+        <w:sz w:val="20"/>
+      </w:rPr>
+    </w:lvl>
+    <w:lvl w:ilvl="1" w:tentative="1">
+      <w:start w:val="1"/>
+      <w:numFmt w:val="bullet"/>
+      <w:lvlText w:val="o"/>
+      <w:lvlJc w:val="left"/>
+      <w:pPr>
+        <w:tabs>
+          <w:tab w:val="num" w:pos="1440"/>
+        </w:tabs>
+        <w:ind w:left="1440" w:hanging="360"/>
+      </w:pPr>
+      <w:rPr>
+        <w:rFonts w:ascii="Courier New" w:hAnsi="Courier New" w:hint="default"/>
+        <w:sz w:val="20"/>
+      </w:rPr>
+    </w:lvl>
+    <w:lvl w:ilvl="2" w:tentative="1">
+      <w:start w:val="1"/>
+      <w:numFmt w:val="bullet"/>
+      <w:lvlText w:val=""/>
+      <w:lvlJc w:val="left"/>
+      <w:pPr>
+        <w:tabs>
+          <w:tab w:val="num" w:pos="2160"/>
+        </w:tabs>
+        <w:ind w:left="2160" w:hanging="360"/>
+      </w:pPr>
+      <w:rPr>
+        <w:rFonts w:ascii="Wingdings" w:hAnsi="Wingdings" w:hint="default"/>
+        <w:sz w:val="20"/>
+      </w:rPr>
+    </w:lvl>
+    <w:lvl w:ilvl="3" w:tentative="1">
+      <w:start w:val="1"/>
+      <w:numFmt w:val="bullet"/>
+      <w:lvlText w:val=""/>
+      <w:lvlJc w:val="left"/>
+      <w:pPr>
+        <w:tabs>
+          <w:tab w:val="num" w:pos="2880"/>
+        </w:tabs>
+        <w:ind w:left="2880" w:hanging="360"/>
+      </w:pPr>
+      <w:rPr>
+        <w:rFonts w:ascii="Wingdings" w:hAnsi="Wingdings" w:hint="default"/>
+        <w:sz w:val="20"/>
+      </w:rPr>
+    </w:lvl>
+    <w:lvl w:ilvl="4" w:tentative="1">
+      <w:start w:val="1"/>
+      <w:numFmt w:val="bullet"/>
+      <w:lvlText w:val=""/>
+      <w:lvlJc w:val="left"/>
+      <w:pPr>
+        <w:tabs>
+          <w:tab w:val="num" w:pos="3600"/>
+        </w:tabs>
+        <w:ind w:left="3600" w:hanging="360"/>
+      </w:pPr>
+      <w:rPr>
+        <w:rFonts w:ascii="Wingdings" w:hAnsi="Wingdings" w:hint="default"/>
+        <w:sz w:val="20"/>
+      </w:rPr>
+    </w:lvl>
+    <w:lvl w:ilvl="5" w:tentative="1">
+      <w:start w:val="1"/>
+      <w:numFmt w:val="bullet"/>
+      <w:lvlText w:val=""/>
+      <w:lvlJc w:val="left"/>
+      <w:pPr>
+        <w:tabs>
+          <w:tab w:val="num" w:pos="4320"/>
+        </w:tabs>
+        <w:ind w:left="4320" w:hanging="360"/>
+      </w:pPr>
+      <w:rPr>
+        <w:rFonts w:ascii="Wingdings" w:hAnsi="Wingdings" w:hint="default"/>
+        <w:sz w:val="20"/>
+      </w:rPr>
+    </w:lvl>
+    <w:lvl w:ilvl="6" w:tentative="1">
+      <w:start w:val="1"/>
+      <w:numFmt w:val="bullet"/>
+      <w:lvlText w:val=""/>
+      <w:lvlJc w:val="left"/>
+      <w:pPr>
+        <w:tabs>
+          <w:tab w:val="num" w:pos="5040"/>
+        </w:tabs>
+        <w:ind w:left="5040" w:hanging="360"/>
+      </w:pPr>
+      <w:rPr>
+        <w:rFonts w:ascii="Wingdings" w:hAnsi="Wingdings" w:hint="default"/>
+        <w:sz w:val="20"/>
+      </w:rPr>
+    </w:lvl>
+    <w:lvl w:ilvl="7" w:tentative="1">
+      <w:start w:val="1"/>
+      <w:numFmt w:val="bullet"/>
+      <w:lvlText w:val=""/>
+      <w:lvlJc w:val="left"/>
+      <w:pPr>
+        <w:tabs>
+          <w:tab w:val="num" w:pos="5760"/>
+        </w:tabs>
+        <w:ind w:left="5760" w:hanging="360"/>
+      </w:pPr>
+      <w:rPr>
+        <w:rFonts w:ascii="Wingdings" w:hAnsi="Wingdings" w:hint="default"/>
+        <w:sz w:val="20"/>
+      </w:rPr>
+    </w:lvl>
+    <w:lvl w:ilvl="8" w:tentative="1">
+      <w:start w:val="1"/>
+      <w:numFmt w:val="bullet"/>
+      <w:lvlText w:val=""/>
+      <w:lvlJc w:val="left"/>
+      <w:pPr>
+        <w:tabs>
+          <w:tab w:val="num" w:pos="6480"/>
+        </w:tabs>
+        <w:ind w:left="6480" w:hanging="360"/>
+      </w:pPr>
+      <w:rPr>
+        <w:rFonts w:ascii="Wingdings" w:hAnsi="Wingdings" w:hint="default"/>
+        <w:sz w:val="20"/>
+      </w:rPr>
+    </w:lvl>
+  </w:abstractNum>
+  <w:abstractNum w:abstractNumId="7" w15:restartNumberingAfterBreak="0">
+    <w:nsid w:val="5CEB7B31"/>
+    <w:multiLevelType w:val="multilevel"/>
+    <w:tmpl w:val="D862BA74"/>
+    <w:lvl w:ilvl="0">
+      <w:start w:val="1"/>
+      <w:numFmt w:val="bullet"/>
+      <w:lvlText w:val=""/>
+      <w:lvlJc w:val="left"/>
+      <w:pPr>
+        <w:tabs>
+          <w:tab w:val="num" w:pos="720"/>
+        </w:tabs>
+        <w:ind w:left="720" w:hanging="360"/>
+      </w:pPr>
+      <w:rPr>
+        <w:rFonts w:ascii="Symbol" w:hAnsi="Symbol" w:hint="default"/>
+        <w:sz w:val="20"/>
+      </w:rPr>
+    </w:lvl>
+    <w:lvl w:ilvl="1" w:tentative="1">
+      <w:start w:val="1"/>
+      <w:numFmt w:val="bullet"/>
+      <w:lvlText w:val="o"/>
+      <w:lvlJc w:val="left"/>
+      <w:pPr>
+        <w:tabs>
+          <w:tab w:val="num" w:pos="1440"/>
+        </w:tabs>
+        <w:ind w:left="1440" w:hanging="360"/>
+      </w:pPr>
+      <w:rPr>
+        <w:rFonts w:ascii="Courier New" w:hAnsi="Courier New" w:hint="default"/>
+        <w:sz w:val="20"/>
+      </w:rPr>
+    </w:lvl>
+    <w:lvl w:ilvl="2" w:tentative="1">
+      <w:start w:val="1"/>
+      <w:numFmt w:val="bullet"/>
+      <w:lvlText w:val=""/>
+      <w:lvlJc w:val="left"/>
+      <w:pPr>
+        <w:tabs>
+          <w:tab w:val="num" w:pos="2160"/>
+        </w:tabs>
+        <w:ind w:left="2160" w:hanging="360"/>
+      </w:pPr>
+      <w:rPr>
+        <w:rFonts w:ascii="Wingdings" w:hAnsi="Wingdings" w:hint="default"/>
+        <w:sz w:val="20"/>
+      </w:rPr>
+    </w:lvl>
+    <w:lvl w:ilvl="3" w:tentative="1">
+      <w:start w:val="1"/>
+      <w:numFmt w:val="bullet"/>
+      <w:lvlText w:val=""/>
+      <w:lvlJc w:val="left"/>
+      <w:pPr>
+        <w:tabs>
+          <w:tab w:val="num" w:pos="2880"/>
+        </w:tabs>
+        <w:ind w:left="2880" w:hanging="360"/>
+      </w:pPr>
+      <w:rPr>
+        <w:rFonts w:ascii="Wingdings" w:hAnsi="Wingdings" w:hint="default"/>
+        <w:sz w:val="20"/>
+      </w:rPr>
+    </w:lvl>
+    <w:lvl w:ilvl="4" w:tentative="1">
+      <w:start w:val="1"/>
+      <w:numFmt w:val="bullet"/>
+      <w:lvlText w:val=""/>
+      <w:lvlJc w:val="left"/>
+      <w:pPr>
+        <w:tabs>
+          <w:tab w:val="num" w:pos="3600"/>
+        </w:tabs>
+        <w:ind w:left="3600" w:hanging="360"/>
+      </w:pPr>
+      <w:rPr>
+        <w:rFonts w:ascii="Wingdings" w:hAnsi="Wingdings" w:hint="default"/>
+        <w:sz w:val="20"/>
+      </w:rPr>
+    </w:lvl>
+    <w:lvl w:ilvl="5" w:tentative="1">
+      <w:start w:val="1"/>
+      <w:numFmt w:val="bullet"/>
+      <w:lvlText w:val=""/>
+      <w:lvlJc w:val="left"/>
+      <w:pPr>
+        <w:tabs>
+          <w:tab w:val="num" w:pos="4320"/>
+        </w:tabs>
+        <w:ind w:left="4320" w:hanging="360"/>
+      </w:pPr>
+      <w:rPr>
+        <w:rFonts w:ascii="Wingdings" w:hAnsi="Wingdings" w:hint="default"/>
+        <w:sz w:val="20"/>
+      </w:rPr>
+    </w:lvl>
+    <w:lvl w:ilvl="6" w:tentative="1">
+      <w:start w:val="1"/>
+      <w:numFmt w:val="bullet"/>
+      <w:lvlText w:val=""/>
+      <w:lvlJc w:val="left"/>
+      <w:pPr>
+        <w:tabs>
+          <w:tab w:val="num" w:pos="5040"/>
+        </w:tabs>
+        <w:ind w:left="5040" w:hanging="360"/>
+      </w:pPr>
+      <w:rPr>
+        <w:rFonts w:ascii="Wingdings" w:hAnsi="Wingdings" w:hint="default"/>
+        <w:sz w:val="20"/>
+      </w:rPr>
+    </w:lvl>
+    <w:lvl w:ilvl="7" w:tentative="1">
+      <w:start w:val="1"/>
+      <w:numFmt w:val="bullet"/>
+      <w:lvlText w:val=""/>
+      <w:lvlJc w:val="left"/>
+      <w:pPr>
+        <w:tabs>
+          <w:tab w:val="num" w:pos="5760"/>
+        </w:tabs>
+        <w:ind w:left="5760" w:hanging="360"/>
+      </w:pPr>
+      <w:rPr>
+        <w:rFonts w:ascii="Wingdings" w:hAnsi="Wingdings" w:hint="default"/>
+        <w:sz w:val="20"/>
+      </w:rPr>
+    </w:lvl>
+    <w:lvl w:ilvl="8" w:tentative="1">
+      <w:start w:val="1"/>
+      <w:numFmt w:val="bullet"/>
+      <w:lvlText w:val=""/>
+      <w:lvlJc w:val="left"/>
+      <w:pPr>
+        <w:tabs>
+          <w:tab w:val="num" w:pos="6480"/>
+        </w:tabs>
+        <w:ind w:left="6480" w:hanging="360"/>
+      </w:pPr>
+      <w:rPr>
+        <w:rFonts w:ascii="Wingdings" w:hAnsi="Wingdings" w:hint="default"/>
+        <w:sz w:val="20"/>
+      </w:rPr>
+    </w:lvl>
+  </w:abstractNum>
+  <w:abstractNum w:abstractNumId="8" w15:restartNumberingAfterBreak="0">
+    <w:nsid w:val="5D815C8C"/>
+    <w:multiLevelType w:val="multilevel"/>
+    <w:tmpl w:val="51DCD0F4"/>
+    <w:lvl w:ilvl="0">
+      <w:start w:val="1"/>
+      <w:numFmt w:val="bullet"/>
+      <w:lvlText w:val=""/>
+      <w:lvlJc w:val="left"/>
+      <w:pPr>
+        <w:tabs>
+          <w:tab w:val="num" w:pos="720"/>
+        </w:tabs>
+        <w:ind w:left="720" w:hanging="360"/>
+      </w:pPr>
+      <w:rPr>
+        <w:rFonts w:ascii="Symbol" w:hAnsi="Symbol" w:hint="default"/>
+        <w:sz w:val="20"/>
+      </w:rPr>
+    </w:lvl>
+    <w:lvl w:ilvl="1" w:tentative="1">
+      <w:start w:val="1"/>
+      <w:numFmt w:val="bullet"/>
+      <w:lvlText w:val="o"/>
+      <w:lvlJc w:val="left"/>
+      <w:pPr>
+        <w:tabs>
+          <w:tab w:val="num" w:pos="1440"/>
+        </w:tabs>
+        <w:ind w:left="1440" w:hanging="360"/>
+      </w:pPr>
+      <w:rPr>
+        <w:rFonts w:ascii="Courier New" w:hAnsi="Courier New" w:hint="default"/>
+        <w:sz w:val="20"/>
+      </w:rPr>
+    </w:lvl>
+    <w:lvl w:ilvl="2" w:tentative="1">
+      <w:start w:val="1"/>
+      <w:numFmt w:val="bullet"/>
+      <w:lvlText w:val=""/>
+      <w:lvlJc w:val="left"/>
+      <w:pPr>
+        <w:tabs>
+          <w:tab w:val="num" w:pos="2160"/>
+        </w:tabs>
+        <w:ind w:left="2160" w:hanging="360"/>
+      </w:pPr>
+      <w:rPr>
+        <w:rFonts w:ascii="Wingdings" w:hAnsi="Wingdings" w:hint="default"/>
+        <w:sz w:val="20"/>
+      </w:rPr>
+    </w:lvl>
+    <w:lvl w:ilvl="3" w:tentative="1">
+      <w:start w:val="1"/>
+      <w:numFmt w:val="bullet"/>
+      <w:lvlText w:val=""/>
+      <w:lvlJc w:val="left"/>
+      <w:pPr>
+        <w:tabs>
+          <w:tab w:val="num" w:pos="2880"/>
+        </w:tabs>
+        <w:ind w:left="2880" w:hanging="360"/>
+      </w:pPr>
+      <w:rPr>
+        <w:rFonts w:ascii="Wingdings" w:hAnsi="Wingdings" w:hint="default"/>
+        <w:sz w:val="20"/>
+      </w:rPr>
+    </w:lvl>
+    <w:lvl w:ilvl="4" w:tentative="1">
+      <w:start w:val="1"/>
+      <w:numFmt w:val="bullet"/>
+      <w:lvlText w:val=""/>
+      <w:lvlJc w:val="left"/>
+      <w:pPr>
+        <w:tabs>
+          <w:tab w:val="num" w:pos="3600"/>
+        </w:tabs>
+        <w:ind w:left="3600" w:hanging="360"/>
+      </w:pPr>
+      <w:rPr>
+        <w:rFonts w:ascii="Wingdings" w:hAnsi="Wingdings" w:hint="default"/>
+        <w:sz w:val="20"/>
+      </w:rPr>
+    </w:lvl>
+    <w:lvl w:ilvl="5" w:tentative="1">
+      <w:start w:val="1"/>
+      <w:numFmt w:val="bullet"/>
+      <w:lvlText w:val=""/>
+      <w:lvlJc w:val="left"/>
+      <w:pPr>
+        <w:tabs>
+          <w:tab w:val="num" w:pos="4320"/>
+        </w:tabs>
+        <w:ind w:left="4320" w:hanging="360"/>
+      </w:pPr>
+      <w:rPr>
+        <w:rFonts w:ascii="Wingdings" w:hAnsi="Wingdings" w:hint="default"/>
+        <w:sz w:val="20"/>
+      </w:rPr>
+    </w:lvl>
+    <w:lvl w:ilvl="6" w:tentative="1">
+      <w:start w:val="1"/>
+      <w:numFmt w:val="bullet"/>
+      <w:lvlText w:val=""/>
+      <w:lvlJc w:val="left"/>
+      <w:pPr>
+        <w:tabs>
+          <w:tab w:val="num" w:pos="5040"/>
+        </w:tabs>
+        <w:ind w:left="5040" w:hanging="360"/>
+      </w:pPr>
+      <w:rPr>
+        <w:rFonts w:ascii="Wingdings" w:hAnsi="Wingdings" w:hint="default"/>
+        <w:sz w:val="20"/>
+      </w:rPr>
+    </w:lvl>
+    <w:lvl w:ilvl="7" w:tentative="1">
+      <w:start w:val="1"/>
+      <w:numFmt w:val="bullet"/>
+      <w:lvlText w:val=""/>
+      <w:lvlJc w:val="left"/>
+      <w:pPr>
+        <w:tabs>
+          <w:tab w:val="num" w:pos="5760"/>
+        </w:tabs>
+        <w:ind w:left="5760" w:hanging="360"/>
+      </w:pPr>
+      <w:rPr>
+        <w:rFonts w:ascii="Wingdings" w:hAnsi="Wingdings" w:hint="default"/>
+        <w:sz w:val="20"/>
+      </w:rPr>
+    </w:lvl>
+    <w:lvl w:ilvl="8" w:tentative="1">
+      <w:start w:val="1"/>
+      <w:numFmt w:val="bullet"/>
+      <w:lvlText w:val=""/>
+      <w:lvlJc w:val="left"/>
+      <w:pPr>
+        <w:tabs>
+          <w:tab w:val="num" w:pos="6480"/>
+        </w:tabs>
+        <w:ind w:left="6480" w:hanging="360"/>
+      </w:pPr>
+      <w:rPr>
+        <w:rFonts w:ascii="Wingdings" w:hAnsi="Wingdings" w:hint="default"/>
+        <w:sz w:val="20"/>
+      </w:rPr>
+    </w:lvl>
+  </w:abstractNum>
+  <w:abstractNum w:abstractNumId="9" w15:restartNumberingAfterBreak="0">
+    <w:nsid w:val="5DE267F7"/>
+    <w:multiLevelType w:val="multilevel"/>
+    <w:tmpl w:val="6A1C42FA"/>
+    <w:lvl w:ilvl="0">
+      <w:start w:val="1"/>
+      <w:numFmt w:val="bullet"/>
+      <w:lvlText w:val=""/>
+      <w:lvlJc w:val="left"/>
+      <w:pPr>
+        <w:tabs>
+          <w:tab w:val="num" w:pos="720"/>
+        </w:tabs>
+        <w:ind w:left="720" w:hanging="360"/>
+      </w:pPr>
+      <w:rPr>
+        <w:rFonts w:ascii="Symbol" w:hAnsi="Symbol" w:hint="default"/>
+        <w:sz w:val="20"/>
+      </w:rPr>
+    </w:lvl>
+    <w:lvl w:ilvl="1" w:tentative="1">
+      <w:start w:val="1"/>
+      <w:numFmt w:val="bullet"/>
+      <w:lvlText w:val="o"/>
+      <w:lvlJc w:val="left"/>
+      <w:pPr>
+        <w:tabs>
+          <w:tab w:val="num" w:pos="1440"/>
+        </w:tabs>
+        <w:ind w:left="1440" w:hanging="360"/>
+      </w:pPr>
+      <w:rPr>
+        <w:rFonts w:ascii="Courier New" w:hAnsi="Courier New" w:hint="default"/>
+        <w:sz w:val="20"/>
+      </w:rPr>
+    </w:lvl>
+    <w:lvl w:ilvl="2" w:tentative="1">
+      <w:start w:val="1"/>
+      <w:numFmt w:val="bullet"/>
+      <w:lvlText w:val=""/>
+      <w:lvlJc w:val="left"/>
+      <w:pPr>
+        <w:tabs>
+          <w:tab w:val="num" w:pos="2160"/>
+        </w:tabs>
+        <w:ind w:left="2160" w:hanging="360"/>
+      </w:pPr>
+      <w:rPr>
+        <w:rFonts w:ascii="Wingdings" w:hAnsi="Wingdings" w:hint="default"/>
+        <w:sz w:val="20"/>
+      </w:rPr>
+    </w:lvl>
+    <w:lvl w:ilvl="3" w:tentative="1">
+      <w:start w:val="1"/>
+      <w:numFmt w:val="bullet"/>
+      <w:lvlText w:val=""/>
+      <w:lvlJc w:val="left"/>
+      <w:pPr>
+        <w:tabs>
+          <w:tab w:val="num" w:pos="2880"/>
+        </w:tabs>
+        <w:ind w:left="2880" w:hanging="360"/>
+      </w:pPr>
+      <w:rPr>
+        <w:rFonts w:ascii="Wingdings" w:hAnsi="Wingdings" w:hint="default"/>
+        <w:sz w:val="20"/>
+      </w:rPr>
+    </w:lvl>
+    <w:lvl w:ilvl="4" w:tentative="1">
+      <w:start w:val="1"/>
+      <w:numFmt w:val="bullet"/>
+      <w:lvlText w:val=""/>
+      <w:lvlJc w:val="left"/>
+      <w:pPr>
+        <w:tabs>
+          <w:tab w:val="num" w:pos="3600"/>
+        </w:tabs>
+        <w:ind w:left="3600" w:hanging="360"/>
+      </w:pPr>
+      <w:rPr>
+        <w:rFonts w:ascii="Wingdings" w:hAnsi="Wingdings" w:hint="default"/>
+        <w:sz w:val="20"/>
+      </w:rPr>
+    </w:lvl>
+    <w:lvl w:ilvl="5" w:tentative="1">
+      <w:start w:val="1"/>
+      <w:numFmt w:val="bullet"/>
+      <w:lvlText w:val=""/>
+      <w:lvlJc w:val="left"/>
+      <w:pPr>
+        <w:tabs>
+          <w:tab w:val="num" w:pos="4320"/>
+        </w:tabs>
+        <w:ind w:left="4320" w:hanging="360"/>
+      </w:pPr>
+      <w:rPr>
+        <w:rFonts w:ascii="Wingdings" w:hAnsi="Wingdings" w:hint="default"/>
+        <w:sz w:val="20"/>
+      </w:rPr>
+    </w:lvl>
+    <w:lvl w:ilvl="6" w:tentative="1">
+      <w:start w:val="1"/>
+      <w:numFmt w:val="bullet"/>
+      <w:lvlText w:val=""/>
+      <w:lvlJc w:val="left"/>
+      <w:pPr>
+        <w:tabs>
+          <w:tab w:val="num" w:pos="5040"/>
+        </w:tabs>
+        <w:ind w:left="5040" w:hanging="360"/>
+      </w:pPr>
+      <w:rPr>
+        <w:rFonts w:ascii="Wingdings" w:hAnsi="Wingdings" w:hint="default"/>
+        <w:sz w:val="20"/>
+      </w:rPr>
+    </w:lvl>
+    <w:lvl w:ilvl="7" w:tentative="1">
+      <w:start w:val="1"/>
+      <w:numFmt w:val="bullet"/>
+      <w:lvlText w:val=""/>
+      <w:lvlJc w:val="left"/>
+      <w:pPr>
+        <w:tabs>
+          <w:tab w:val="num" w:pos="5760"/>
+        </w:tabs>
+        <w:ind w:left="5760" w:hanging="360"/>
+      </w:pPr>
+      <w:rPr>
+        <w:rFonts w:ascii="Wingdings" w:hAnsi="Wingdings" w:hint="default"/>
+        <w:sz w:val="20"/>
+      </w:rPr>
+    </w:lvl>
+    <w:lvl w:ilvl="8" w:tentative="1">
+      <w:start w:val="1"/>
+      <w:numFmt w:val="bullet"/>
+      <w:lvlText w:val=""/>
+      <w:lvlJc w:val="left"/>
+      <w:pPr>
+        <w:tabs>
+          <w:tab w:val="num" w:pos="6480"/>
+        </w:tabs>
+        <w:ind w:left="6480" w:hanging="360"/>
+      </w:pPr>
+      <w:rPr>
+        <w:rFonts w:ascii="Wingdings" w:hAnsi="Wingdings" w:hint="default"/>
+        <w:sz w:val="20"/>
+      </w:rPr>
+    </w:lvl>
+  </w:abstractNum>
+  <w:abstractNum w:abstractNumId="10" w15:restartNumberingAfterBreak="0">
+    <w:nsid w:val="60EA372D"/>
+    <w:multiLevelType w:val="multilevel"/>
+    <w:tmpl w:val="EAA8AF8A"/>
+    <w:lvl w:ilvl="0">
+      <w:start w:val="1"/>
+      <w:numFmt w:val="bullet"/>
+      <w:lvlText w:val=""/>
+      <w:lvlJc w:val="left"/>
+      <w:pPr>
+        <w:tabs>
+          <w:tab w:val="num" w:pos="720"/>
+        </w:tabs>
+        <w:ind w:left="720" w:hanging="360"/>
+      </w:pPr>
+      <w:rPr>
+        <w:rFonts w:ascii="Symbol" w:hAnsi="Symbol" w:hint="default"/>
+        <w:sz w:val="20"/>
+      </w:rPr>
+    </w:lvl>
+    <w:lvl w:ilvl="1" w:tentative="1">
+      <w:start w:val="1"/>
+      <w:numFmt w:val="bullet"/>
+      <w:lvlText w:val="o"/>
+      <w:lvlJc w:val="left"/>
+      <w:pPr>
+        <w:tabs>
+          <w:tab w:val="num" w:pos="1440"/>
+        </w:tabs>
+        <w:ind w:left="1440" w:hanging="360"/>
+      </w:pPr>
+      <w:rPr>
+        <w:rFonts w:ascii="Courier New" w:hAnsi="Courier New" w:hint="default"/>
+        <w:sz w:val="20"/>
+      </w:rPr>
+    </w:lvl>
+    <w:lvl w:ilvl="2" w:tentative="1">
+      <w:start w:val="1"/>
+      <w:numFmt w:val="bullet"/>
+      <w:lvlText w:val=""/>
+      <w:lvlJc w:val="left"/>
+      <w:pPr>
+        <w:tabs>
+          <w:tab w:val="num" w:pos="2160"/>
+        </w:tabs>
+        <w:ind w:left="2160" w:hanging="360"/>
+      </w:pPr>
+      <w:rPr>
+        <w:rFonts w:ascii="Wingdings" w:hAnsi="Wingdings" w:hint="default"/>
+        <w:sz w:val="20"/>
+      </w:rPr>
+    </w:lvl>
+    <w:lvl w:ilvl="3" w:tentative="1">
+      <w:start w:val="1"/>
+      <w:numFmt w:val="bullet"/>
+      <w:lvlText w:val=""/>
+      <w:lvlJc w:val="left"/>
+      <w:pPr>
+        <w:tabs>
+          <w:tab w:val="num" w:pos="2880"/>
+        </w:tabs>
+        <w:ind w:left="2880" w:hanging="360"/>
+      </w:pPr>
+      <w:rPr>
+        <w:rFonts w:ascii="Wingdings" w:hAnsi="Wingdings" w:hint="default"/>
+        <w:sz w:val="20"/>
+      </w:rPr>
+    </w:lvl>
+    <w:lvl w:ilvl="4" w:tentative="1">
+      <w:start w:val="1"/>
+      <w:numFmt w:val="bullet"/>
+      <w:lvlText w:val=""/>
+      <w:lvlJc w:val="left"/>
+      <w:pPr>
+        <w:tabs>
+          <w:tab w:val="num" w:pos="3600"/>
+        </w:tabs>
+        <w:ind w:left="3600" w:hanging="360"/>
+      </w:pPr>
+      <w:rPr>
+        <w:rFonts w:ascii="Wingdings" w:hAnsi="Wingdings" w:hint="default"/>
+        <w:sz w:val="20"/>
+      </w:rPr>
+    </w:lvl>
+    <w:lvl w:ilvl="5" w:tentative="1">
+      <w:start w:val="1"/>
+      <w:numFmt w:val="bullet"/>
+      <w:lvlText w:val=""/>
+      <w:lvlJc w:val="left"/>
+      <w:pPr>
+        <w:tabs>
+          <w:tab w:val="num" w:pos="4320"/>
+        </w:tabs>
+        <w:ind w:left="4320" w:hanging="360"/>
+      </w:pPr>
+      <w:rPr>
+        <w:rFonts w:ascii="Wingdings" w:hAnsi="Wingdings" w:hint="default"/>
+        <w:sz w:val="20"/>
+      </w:rPr>
+    </w:lvl>
+    <w:lvl w:ilvl="6" w:tentative="1">
+      <w:start w:val="1"/>
+      <w:numFmt w:val="bullet"/>
+      <w:lvlText w:val=""/>
+      <w:lvlJc w:val="left"/>
+      <w:pPr>
+        <w:tabs>
+          <w:tab w:val="num" w:pos="5040"/>
+        </w:tabs>
+        <w:ind w:left="5040" w:hanging="360"/>
+      </w:pPr>
+      <w:rPr>
+        <w:rFonts w:ascii="Wingdings" w:hAnsi="Wingdings" w:hint="default"/>
+        <w:sz w:val="20"/>
+      </w:rPr>
+    </w:lvl>
+    <w:lvl w:ilvl="7" w:tentative="1">
+      <w:start w:val="1"/>
+      <w:numFmt w:val="bullet"/>
+      <w:lvlText w:val=""/>
+      <w:lvlJc w:val="left"/>
+      <w:pPr>
+        <w:tabs>
+          <w:tab w:val="num" w:pos="5760"/>
+        </w:tabs>
+        <w:ind w:left="5760" w:hanging="360"/>
+      </w:pPr>
+      <w:rPr>
+        <w:rFonts w:ascii="Wingdings" w:hAnsi="Wingdings" w:hint="default"/>
+        <w:sz w:val="20"/>
+      </w:rPr>
+    </w:lvl>
+    <w:lvl w:ilvl="8" w:tentative="1">
+      <w:start w:val="1"/>
+      <w:numFmt w:val="bullet"/>
+      <w:lvlText w:val=""/>
+      <w:lvlJc w:val="left"/>
+      <w:pPr>
+        <w:tabs>
+          <w:tab w:val="num" w:pos="6480"/>
+        </w:tabs>
+        <w:ind w:left="6480" w:hanging="360"/>
+      </w:pPr>
+      <w:rPr>
+        <w:rFonts w:ascii="Wingdings" w:hAnsi="Wingdings" w:hint="default"/>
+        <w:sz w:val="20"/>
+      </w:rPr>
+    </w:lvl>
+  </w:abstractNum>
+  <w:abstractNum w:abstractNumId="11" w15:restartNumberingAfterBreak="0">
+    <w:nsid w:val="66604B87"/>
+    <w:multiLevelType w:val="multilevel"/>
+    <w:tmpl w:val="75FE010E"/>
+    <w:lvl w:ilvl="0">
+      <w:start w:val="1"/>
+      <w:numFmt w:val="bullet"/>
+      <w:lvlText w:val=""/>
+      <w:lvlJc w:val="left"/>
+      <w:pPr>
+        <w:tabs>
+          <w:tab w:val="num" w:pos="720"/>
+        </w:tabs>
+        <w:ind w:left="720" w:hanging="360"/>
+      </w:pPr>
+      <w:rPr>
+        <w:rFonts w:ascii="Symbol" w:hAnsi="Symbol" w:hint="default"/>
+        <w:sz w:val="20"/>
+      </w:rPr>
+    </w:lvl>
+    <w:lvl w:ilvl="1" w:tentative="1">
+      <w:start w:val="1"/>
+      <w:numFmt w:val="bullet"/>
+      <w:lvlText w:val="o"/>
+      <w:lvlJc w:val="left"/>
+      <w:pPr>
+        <w:tabs>
+          <w:tab w:val="num" w:pos="1440"/>
+        </w:tabs>
+        <w:ind w:left="1440" w:hanging="360"/>
+      </w:pPr>
+      <w:rPr>
+        <w:rFonts w:ascii="Courier New" w:hAnsi="Courier New" w:hint="default"/>
+        <w:sz w:val="20"/>
+      </w:rPr>
+    </w:lvl>
+    <w:lvl w:ilvl="2" w:tentative="1">
+      <w:start w:val="1"/>
+      <w:numFmt w:val="bullet"/>
+      <w:lvlText w:val=""/>
+      <w:lvlJc w:val="left"/>
+      <w:pPr>
+        <w:tabs>
+          <w:tab w:val="num" w:pos="2160"/>
+        </w:tabs>
+        <w:ind w:left="2160" w:hanging="360"/>
+      </w:pPr>
+      <w:rPr>
+        <w:rFonts w:ascii="Wingdings" w:hAnsi="Wingdings" w:hint="default"/>
+        <w:sz w:val="20"/>
+      </w:rPr>
+    </w:lvl>
+    <w:lvl w:ilvl="3" w:tentative="1">
+      <w:start w:val="1"/>
+      <w:numFmt w:val="bullet"/>
+      <w:lvlText w:val=""/>
+      <w:lvlJc w:val="left"/>
+      <w:pPr>
+        <w:tabs>
+          <w:tab w:val="num" w:pos="2880"/>
+        </w:tabs>
+        <w:ind w:left="2880" w:hanging="360"/>
+      </w:pPr>
+      <w:rPr>
+        <w:rFonts w:ascii="Wingdings" w:hAnsi="Wingdings" w:hint="default"/>
+        <w:sz w:val="20"/>
+      </w:rPr>
+    </w:lvl>
+    <w:lvl w:ilvl="4" w:tentative="1">
+      <w:start w:val="1"/>
+      <w:numFmt w:val="bullet"/>
+      <w:lvlText w:val=""/>
+      <w:lvlJc w:val="left"/>
+      <w:pPr>
+        <w:tabs>
+          <w:tab w:val="num" w:pos="3600"/>
+        </w:tabs>
+        <w:ind w:left="3600" w:hanging="360"/>
+      </w:pPr>
+      <w:rPr>
+        <w:rFonts w:ascii="Wingdings" w:hAnsi="Wingdings" w:hint="default"/>
+        <w:sz w:val="20"/>
+      </w:rPr>
+    </w:lvl>
+    <w:lvl w:ilvl="5" w:tentative="1">
+      <w:start w:val="1"/>
+      <w:numFmt w:val="bullet"/>
+      <w:lvlText w:val=""/>
+      <w:lvlJc w:val="left"/>
+      <w:pPr>
+        <w:tabs>
+          <w:tab w:val="num" w:pos="4320"/>
+        </w:tabs>
+        <w:ind w:left="4320" w:hanging="360"/>
+      </w:pPr>
+      <w:rPr>
+        <w:rFonts w:ascii="Wingdings" w:hAnsi="Wingdings" w:hint="default"/>
+        <w:sz w:val="20"/>
+      </w:rPr>
+    </w:lvl>
+    <w:lvl w:ilvl="6" w:tentative="1">
+      <w:start w:val="1"/>
+      <w:numFmt w:val="bullet"/>
+      <w:lvlText w:val=""/>
+      <w:lvlJc w:val="left"/>
+      <w:pPr>
+        <w:tabs>
+          <w:tab w:val="num" w:pos="5040"/>
+        </w:tabs>
+        <w:ind w:left="5040" w:hanging="360"/>
+      </w:pPr>
+      <w:rPr>
+        <w:rFonts w:ascii="Wingdings" w:hAnsi="Wingdings" w:hint="default"/>
+        <w:sz w:val="20"/>
+      </w:rPr>
+    </w:lvl>
+    <w:lvl w:ilvl="7" w:tentative="1">
+      <w:start w:val="1"/>
+      <w:numFmt w:val="bullet"/>
+      <w:lvlText w:val=""/>
+      <w:lvlJc w:val="left"/>
+      <w:pPr>
+        <w:tabs>
+          <w:tab w:val="num" w:pos="5760"/>
+        </w:tabs>
+        <w:ind w:left="5760" w:hanging="360"/>
+      </w:pPr>
+      <w:rPr>
+        <w:rFonts w:ascii="Wingdings" w:hAnsi="Wingdings" w:hint="default"/>
+        <w:sz w:val="20"/>
+      </w:rPr>
+    </w:lvl>
+    <w:lvl w:ilvl="8" w:tentative="1">
+      <w:start w:val="1"/>
+      <w:numFmt w:val="bullet"/>
+      <w:lvlText w:val=""/>
+      <w:lvlJc w:val="left"/>
+      <w:pPr>
+        <w:tabs>
+          <w:tab w:val="num" w:pos="6480"/>
+        </w:tabs>
+        <w:ind w:left="6480" w:hanging="360"/>
+      </w:pPr>
+      <w:rPr>
+        <w:rFonts w:ascii="Wingdings" w:hAnsi="Wingdings" w:hint="default"/>
+        <w:sz w:val="20"/>
+      </w:rPr>
+    </w:lvl>
+  </w:abstractNum>
+  <w:abstractNum w:abstractNumId="12" w15:restartNumberingAfterBreak="0">
+    <w:nsid w:val="6E45209F"/>
+    <w:multiLevelType w:val="multilevel"/>
+    <w:tmpl w:val="7B1ECC82"/>
+    <w:lvl w:ilvl="0">
+      <w:start w:val="1"/>
+      <w:numFmt w:val="bullet"/>
+      <w:lvlText w:val=""/>
+      <w:lvlJc w:val="left"/>
+      <w:pPr>
+        <w:tabs>
+          <w:tab w:val="num" w:pos="720"/>
+        </w:tabs>
+        <w:ind w:left="720" w:hanging="360"/>
+      </w:pPr>
+      <w:rPr>
+        <w:rFonts w:ascii="Symbol" w:hAnsi="Symbol" w:hint="default"/>
+        <w:sz w:val="20"/>
+      </w:rPr>
+    </w:lvl>
+    <w:lvl w:ilvl="1" w:tentative="1">
+      <w:start w:val="1"/>
+      <w:numFmt w:val="bullet"/>
+      <w:lvlText w:val="o"/>
+      <w:lvlJc w:val="left"/>
+      <w:pPr>
+        <w:tabs>
+          <w:tab w:val="num" w:pos="1440"/>
+        </w:tabs>
+        <w:ind w:left="1440" w:hanging="360"/>
+      </w:pPr>
+      <w:rPr>
+        <w:rFonts w:ascii="Courier New" w:hAnsi="Courier New" w:hint="default"/>
+        <w:sz w:val="20"/>
+      </w:rPr>
+    </w:lvl>
+    <w:lvl w:ilvl="2" w:tentative="1">
+      <w:start w:val="1"/>
+      <w:numFmt w:val="bullet"/>
+      <w:lvlText w:val=""/>
+      <w:lvlJc w:val="left"/>
+      <w:pPr>
+        <w:tabs>
+          <w:tab w:val="num" w:pos="2160"/>
+        </w:tabs>
+        <w:ind w:left="2160" w:hanging="360"/>
+      </w:pPr>
+      <w:rPr>
+        <w:rFonts w:ascii="Wingdings" w:hAnsi="Wingdings" w:hint="default"/>
+        <w:sz w:val="20"/>
+      </w:rPr>
+    </w:lvl>
+    <w:lvl w:ilvl="3" w:tentative="1">
+      <w:start w:val="1"/>
+      <w:numFmt w:val="bullet"/>
+      <w:lvlText w:val=""/>
+      <w:lvlJc w:val="left"/>
+      <w:pPr>
+        <w:tabs>
+          <w:tab w:val="num" w:pos="2880"/>
+        </w:tabs>
+        <w:ind w:left="2880" w:hanging="360"/>
+      </w:pPr>
+      <w:rPr>
+        <w:rFonts w:ascii="Wingdings" w:hAnsi="Wingdings" w:hint="default"/>
+        <w:sz w:val="20"/>
+      </w:rPr>
+    </w:lvl>
+    <w:lvl w:ilvl="4" w:tentative="1">
+      <w:start w:val="1"/>
+      <w:numFmt w:val="bullet"/>
+      <w:lvlText w:val=""/>
+      <w:lvlJc w:val="left"/>
+      <w:pPr>
+        <w:tabs>
+          <w:tab w:val="num" w:pos="3600"/>
+        </w:tabs>
+        <w:ind w:left="3600" w:hanging="360"/>
+      </w:pPr>
+      <w:rPr>
+        <w:rFonts w:ascii="Wingdings" w:hAnsi="Wingdings" w:hint="default"/>
+        <w:sz w:val="20"/>
+      </w:rPr>
+    </w:lvl>
+    <w:lvl w:ilvl="5" w:tentative="1">
+      <w:start w:val="1"/>
+      <w:numFmt w:val="bullet"/>
+      <w:lvlText w:val=""/>
+      <w:lvlJc w:val="left"/>
+      <w:pPr>
+        <w:tabs>
+          <w:tab w:val="num" w:pos="4320"/>
+        </w:tabs>
+        <w:ind w:left="4320" w:hanging="360"/>
+      </w:pPr>
+      <w:rPr>
+        <w:rFonts w:ascii="Wingdings" w:hAnsi="Wingdings" w:hint="default"/>
+        <w:sz w:val="20"/>
+      </w:rPr>
+    </w:lvl>
+    <w:lvl w:ilvl="6" w:tentative="1">
+      <w:start w:val="1"/>
+      <w:numFmt w:val="bullet"/>
+      <w:lvlText w:val=""/>
+      <w:lvlJc w:val="left"/>
+      <w:pPr>
+        <w:tabs>
+          <w:tab w:val="num" w:pos="5040"/>
+        </w:tabs>
+        <w:ind w:left="5040" w:hanging="360"/>
+      </w:pPr>
+      <w:rPr>
+        <w:rFonts w:ascii="Wingdings" w:hAnsi="Wingdings" w:hint="default"/>
+        <w:sz w:val="20"/>
+      </w:rPr>
+    </w:lvl>
+    <w:lvl w:ilvl="7" w:tentative="1">
+      <w:start w:val="1"/>
+      <w:numFmt w:val="bullet"/>
+      <w:lvlText w:val=""/>
+      <w:lvlJc w:val="left"/>
+      <w:pPr>
+        <w:tabs>
+          <w:tab w:val="num" w:pos="5760"/>
+        </w:tabs>
+        <w:ind w:left="5760" w:hanging="360"/>
+      </w:pPr>
+      <w:rPr>
+        <w:rFonts w:ascii="Wingdings" w:hAnsi="Wingdings" w:hint="default"/>
+        <w:sz w:val="20"/>
+      </w:rPr>
+    </w:lvl>
+    <w:lvl w:ilvl="8" w:tentative="1">
+      <w:start w:val="1"/>
+      <w:numFmt w:val="bullet"/>
+      <w:lvlText w:val=""/>
+      <w:lvlJc w:val="left"/>
+      <w:pPr>
+        <w:tabs>
+          <w:tab w:val="num" w:pos="6480"/>
+        </w:tabs>
+        <w:ind w:left="6480" w:hanging="360"/>
+      </w:pPr>
+      <w:rPr>
+        <w:rFonts w:ascii="Wingdings" w:hAnsi="Wingdings" w:hint="default"/>
+        <w:sz w:val="20"/>
+      </w:rPr>
+    </w:lvl>
+  </w:abstractNum>
+  <w:abstractNum w:abstractNumId="13" w15:restartNumberingAfterBreak="0">
+    <w:nsid w:val="723058D7"/>
+    <w:multiLevelType w:val="multilevel"/>
+    <w:tmpl w:val="D5BACF8A"/>
+    <w:lvl w:ilvl="0">
+      <w:start w:val="1"/>
+      <w:numFmt w:val="bullet"/>
+      <w:lvlText w:val=""/>
+      <w:lvlJc w:val="left"/>
+      <w:pPr>
+        <w:tabs>
+          <w:tab w:val="num" w:pos="720"/>
+        </w:tabs>
+        <w:ind w:left="720" w:hanging="360"/>
+      </w:pPr>
+      <w:rPr>
+        <w:rFonts w:ascii="Symbol" w:hAnsi="Symbol" w:hint="default"/>
+        <w:sz w:val="20"/>
+      </w:rPr>
+    </w:lvl>
+    <w:lvl w:ilvl="1" w:tentative="1">
+      <w:start w:val="1"/>
+      <w:numFmt w:val="bullet"/>
+      <w:lvlText w:val="o"/>
+      <w:lvlJc w:val="left"/>
+      <w:pPr>
+        <w:tabs>
+          <w:tab w:val="num" w:pos="1440"/>
+        </w:tabs>
+        <w:ind w:left="1440" w:hanging="360"/>
+      </w:pPr>
+      <w:rPr>
+        <w:rFonts w:ascii="Courier New" w:hAnsi="Courier New" w:hint="default"/>
+        <w:sz w:val="20"/>
+      </w:rPr>
+    </w:lvl>
+    <w:lvl w:ilvl="2" w:tentative="1">
+      <w:start w:val="1"/>
+      <w:numFmt w:val="bullet"/>
+      <w:lvlText w:val=""/>
+      <w:lvlJc w:val="left"/>
+      <w:pPr>
+        <w:tabs>
+          <w:tab w:val="num" w:pos="2160"/>
+        </w:tabs>
+        <w:ind w:left="2160" w:hanging="360"/>
+      </w:pPr>
+      <w:rPr>
+        <w:rFonts w:ascii="Wingdings" w:hAnsi="Wingdings" w:hint="default"/>
+        <w:sz w:val="20"/>
+      </w:rPr>
+    </w:lvl>
+    <w:lvl w:ilvl="3" w:tentative="1">
+      <w:start w:val="1"/>
+      <w:numFmt w:val="bullet"/>
+      <w:lvlText w:val=""/>
+      <w:lvlJc w:val="left"/>
+      <w:pPr>
+        <w:tabs>
+          <w:tab w:val="num" w:pos="2880"/>
+        </w:tabs>
+        <w:ind w:left="2880" w:hanging="360"/>
+      </w:pPr>
+      <w:rPr>
+        <w:rFonts w:ascii="Wingdings" w:hAnsi="Wingdings" w:hint="default"/>
+        <w:sz w:val="20"/>
+      </w:rPr>
+    </w:lvl>
+    <w:lvl w:ilvl="4" w:tentative="1">
+      <w:start w:val="1"/>
+      <w:numFmt w:val="bullet"/>
+      <w:lvlText w:val=""/>
+      <w:lvlJc w:val="left"/>
+      <w:pPr>
+        <w:tabs>
+          <w:tab w:val="num" w:pos="3600"/>
+        </w:tabs>
+        <w:ind w:left="3600" w:hanging="360"/>
+      </w:pPr>
+      <w:rPr>
+        <w:rFonts w:ascii="Wingdings" w:hAnsi="Wingdings" w:hint="default"/>
+        <w:sz w:val="20"/>
+      </w:rPr>
+    </w:lvl>
+    <w:lvl w:ilvl="5" w:tentative="1">
+      <w:start w:val="1"/>
+      <w:numFmt w:val="bullet"/>
+      <w:lvlText w:val=""/>
+      <w:lvlJc w:val="left"/>
+      <w:pPr>
+        <w:tabs>
+          <w:tab w:val="num" w:pos="4320"/>
+        </w:tabs>
+        <w:ind w:left="4320" w:hanging="360"/>
+      </w:pPr>
+      <w:rPr>
+        <w:rFonts w:ascii="Wingdings" w:hAnsi="Wingdings" w:hint="default"/>
+        <w:sz w:val="20"/>
+      </w:rPr>
+    </w:lvl>
+    <w:lvl w:ilvl="6" w:tentative="1">
+      <w:start w:val="1"/>
+      <w:numFmt w:val="bullet"/>
+      <w:lvlText w:val=""/>
+      <w:lvlJc w:val="left"/>
+      <w:pPr>
+        <w:tabs>
+          <w:tab w:val="num" w:pos="5040"/>
+        </w:tabs>
+        <w:ind w:left="5040" w:hanging="360"/>
+      </w:pPr>
+      <w:rPr>
+        <w:rFonts w:ascii="Wingdings" w:hAnsi="Wingdings" w:hint="default"/>
+        <w:sz w:val="20"/>
+      </w:rPr>
+    </w:lvl>
+    <w:lvl w:ilvl="7" w:tentative="1">
+      <w:start w:val="1"/>
+      <w:numFmt w:val="bullet"/>
+      <w:lvlText w:val=""/>
+      <w:lvlJc w:val="left"/>
+      <w:pPr>
+        <w:tabs>
+          <w:tab w:val="num" w:pos="5760"/>
+        </w:tabs>
+        <w:ind w:left="5760" w:hanging="360"/>
+      </w:pPr>
+      <w:rPr>
+        <w:rFonts w:ascii="Wingdings" w:hAnsi="Wingdings" w:hint="default"/>
+        <w:sz w:val="20"/>
+      </w:rPr>
+    </w:lvl>
+    <w:lvl w:ilvl="8" w:tentative="1">
+      <w:start w:val="1"/>
+      <w:numFmt w:val="bullet"/>
+      <w:lvlText w:val=""/>
+      <w:lvlJc w:val="left"/>
+      <w:pPr>
+        <w:tabs>
+          <w:tab w:val="num" w:pos="6480"/>
+        </w:tabs>
+        <w:ind w:left="6480" w:hanging="360"/>
+      </w:pPr>
+      <w:rPr>
+        <w:rFonts w:ascii="Wingdings" w:hAnsi="Wingdings" w:hint="default"/>
+        <w:sz w:val="20"/>
+      </w:rPr>
+    </w:lvl>
+  </w:abstractNum>
+  <w:abstractNum w:abstractNumId="14" w15:restartNumberingAfterBreak="0">
+    <w:nsid w:val="74663A40"/>
+    <w:multiLevelType w:val="multilevel"/>
+    <w:tmpl w:val="BF8CD90A"/>
+    <w:lvl w:ilvl="0">
+      <w:start w:val="1"/>
+      <w:numFmt w:val="bullet"/>
+      <w:lvlText w:val=""/>
+      <w:lvlJc w:val="left"/>
+      <w:pPr>
+        <w:tabs>
+          <w:tab w:val="num" w:pos="720"/>
+        </w:tabs>
+        <w:ind w:left="720" w:hanging="360"/>
+      </w:pPr>
+      <w:rPr>
+        <w:rFonts w:ascii="Symbol" w:hAnsi="Symbol" w:hint="default"/>
+        <w:sz w:val="20"/>
+      </w:rPr>
+    </w:lvl>
+    <w:lvl w:ilvl="1" w:tentative="1">
+      <w:start w:val="1"/>
+      <w:numFmt w:val="bullet"/>
+      <w:lvlText w:val="o"/>
+      <w:lvlJc w:val="left"/>
+      <w:pPr>
+        <w:tabs>
+          <w:tab w:val="num" w:pos="1440"/>
+        </w:tabs>
+        <w:ind w:left="1440" w:hanging="360"/>
+      </w:pPr>
+      <w:rPr>
+        <w:rFonts w:ascii="Courier New" w:hAnsi="Courier New" w:hint="default"/>
+        <w:sz w:val="20"/>
+      </w:rPr>
+    </w:lvl>
+    <w:lvl w:ilvl="2" w:tentative="1">
+      <w:start w:val="1"/>
+      <w:numFmt w:val="bullet"/>
+      <w:lvlText w:val=""/>
+      <w:lvlJc w:val="left"/>
+      <w:pPr>
+        <w:tabs>
+          <w:tab w:val="num" w:pos="2160"/>
+        </w:tabs>
+        <w:ind w:left="2160" w:hanging="360"/>
+      </w:pPr>
+      <w:rPr>
+        <w:rFonts w:ascii="Wingdings" w:hAnsi="Wingdings" w:hint="default"/>
+        <w:sz w:val="20"/>
+      </w:rPr>
+    </w:lvl>
+    <w:lvl w:ilvl="3" w:tentative="1">
+      <w:start w:val="1"/>
+      <w:numFmt w:val="bullet"/>
+      <w:lvlText w:val=""/>
+      <w:lvlJc w:val="left"/>
+      <w:pPr>
+        <w:tabs>
+          <w:tab w:val="num" w:pos="2880"/>
+        </w:tabs>
+        <w:ind w:left="2880" w:hanging="360"/>
+      </w:pPr>
+      <w:rPr>
+        <w:rFonts w:ascii="Wingdings" w:hAnsi="Wingdings" w:hint="default"/>
+        <w:sz w:val="20"/>
+      </w:rPr>
+    </w:lvl>
+    <w:lvl w:ilvl="4" w:tentative="1">
+      <w:start w:val="1"/>
+      <w:numFmt w:val="bullet"/>
+      <w:lvlText w:val=""/>
+      <w:lvlJc w:val="left"/>
+      <w:pPr>
+        <w:tabs>
+          <w:tab w:val="num" w:pos="3600"/>
+        </w:tabs>
+        <w:ind w:left="3600" w:hanging="360"/>
+      </w:pPr>
+      <w:rPr>
+        <w:rFonts w:ascii="Wingdings" w:hAnsi="Wingdings" w:hint="default"/>
+        <w:sz w:val="20"/>
+      </w:rPr>
+    </w:lvl>
+    <w:lvl w:ilvl="5" w:tentative="1">
+      <w:start w:val="1"/>
+      <w:numFmt w:val="bullet"/>
+      <w:lvlText w:val=""/>
+      <w:lvlJc w:val="left"/>
+      <w:pPr>
+        <w:tabs>
+          <w:tab w:val="num" w:pos="4320"/>
+        </w:tabs>
+        <w:ind w:left="4320" w:hanging="360"/>
+      </w:pPr>
+      <w:rPr>
+        <w:rFonts w:ascii="Wingdings" w:hAnsi="Wingdings" w:hint="default"/>
+        <w:sz w:val="20"/>
+      </w:rPr>
+    </w:lvl>
+    <w:lvl w:ilvl="6" w:tentative="1">
+      <w:start w:val="1"/>
+      <w:numFmt w:val="bullet"/>
+      <w:lvlText w:val=""/>
+      <w:lvlJc w:val="left"/>
+      <w:pPr>
+        <w:tabs>
+          <w:tab w:val="num" w:pos="5040"/>
+        </w:tabs>
+        <w:ind w:left="5040" w:hanging="360"/>
+      </w:pPr>
+      <w:rPr>
+        <w:rFonts w:ascii="Wingdings" w:hAnsi="Wingdings" w:hint="default"/>
+        <w:sz w:val="20"/>
+      </w:rPr>
+    </w:lvl>
+    <w:lvl w:ilvl="7" w:tentative="1">
+      <w:start w:val="1"/>
+      <w:numFmt w:val="bullet"/>
+      <w:lvlText w:val=""/>
+      <w:lvlJc w:val="left"/>
+      <w:pPr>
+        <w:tabs>
+          <w:tab w:val="num" w:pos="5760"/>
+        </w:tabs>
+        <w:ind w:left="5760" w:hanging="360"/>
+      </w:pPr>
+      <w:rPr>
+        <w:rFonts w:ascii="Wingdings" w:hAnsi="Wingdings" w:hint="default"/>
+        <w:sz w:val="20"/>
+      </w:rPr>
+    </w:lvl>
+    <w:lvl w:ilvl="8" w:tentative="1">
+      <w:start w:val="1"/>
+      <w:numFmt w:val="bullet"/>
+      <w:lvlText w:val=""/>
+      <w:lvlJc w:val="left"/>
+      <w:pPr>
+        <w:tabs>
+          <w:tab w:val="num" w:pos="6480"/>
+        </w:tabs>
+        <w:ind w:left="6480" w:hanging="360"/>
+      </w:pPr>
+      <w:rPr>
+        <w:rFonts w:ascii="Wingdings" w:hAnsi="Wingdings" w:hint="default"/>
+        <w:sz w:val="20"/>
+      </w:rPr>
+    </w:lvl>
+  </w:abstractNum>
+  <w:abstractNum w:abstractNumId="15" w15:restartNumberingAfterBreak="0">
+    <w:nsid w:val="78E8285D"/>
+    <w:multiLevelType w:val="multilevel"/>
+    <w:tmpl w:val="41687F96"/>
+    <w:lvl w:ilvl="0">
+      <w:start w:val="1"/>
+      <w:numFmt w:val="bullet"/>
+      <w:lvlText w:val=""/>
+      <w:lvlJc w:val="left"/>
+      <w:pPr>
+        <w:tabs>
+          <w:tab w:val="num" w:pos="720"/>
+        </w:tabs>
+        <w:ind w:left="720" w:hanging="360"/>
+      </w:pPr>
+      <w:rPr>
+        <w:rFonts w:ascii="Symbol" w:hAnsi="Symbol" w:hint="default"/>
+        <w:sz w:val="20"/>
+      </w:rPr>
+    </w:lvl>
+    <w:lvl w:ilvl="1" w:tentative="1">
+      <w:start w:val="1"/>
+      <w:numFmt w:val="bullet"/>
+      <w:lvlText w:val="o"/>
+      <w:lvlJc w:val="left"/>
+      <w:pPr>
+        <w:tabs>
+          <w:tab w:val="num" w:pos="1440"/>
+        </w:tabs>
+        <w:ind w:left="1440" w:hanging="360"/>
+      </w:pPr>
+      <w:rPr>
+        <w:rFonts w:ascii="Courier New" w:hAnsi="Courier New" w:hint="default"/>
+        <w:sz w:val="20"/>
+      </w:rPr>
+    </w:lvl>
+    <w:lvl w:ilvl="2" w:tentative="1">
+      <w:start w:val="1"/>
+      <w:numFmt w:val="bullet"/>
+      <w:lvlText w:val=""/>
+      <w:lvlJc w:val="left"/>
+      <w:pPr>
+        <w:tabs>
+          <w:tab w:val="num" w:pos="2160"/>
+        </w:tabs>
+        <w:ind w:left="2160" w:hanging="360"/>
+      </w:pPr>
+      <w:rPr>
+        <w:rFonts w:ascii="Wingdings" w:hAnsi="Wingdings" w:hint="default"/>
+        <w:sz w:val="20"/>
+      </w:rPr>
+    </w:lvl>
+    <w:lvl w:ilvl="3" w:tentative="1">
+      <w:start w:val="1"/>
+      <w:numFmt w:val="bullet"/>
+      <w:lvlText w:val=""/>
+      <w:lvlJc w:val="left"/>
+      <w:pPr>
+        <w:tabs>
+          <w:tab w:val="num" w:pos="2880"/>
+        </w:tabs>
+        <w:ind w:left="2880" w:hanging="360"/>
+      </w:pPr>
+      <w:rPr>
+        <w:rFonts w:ascii="Wingdings" w:hAnsi="Wingdings" w:hint="default"/>
+        <w:sz w:val="20"/>
+      </w:rPr>
+    </w:lvl>
+    <w:lvl w:ilvl="4" w:tentative="1">
+      <w:start w:val="1"/>
+      <w:numFmt w:val="bullet"/>
+      <w:lvlText w:val=""/>
+      <w:lvlJc w:val="left"/>
+      <w:pPr>
+        <w:tabs>
+          <w:tab w:val="num" w:pos="3600"/>
+        </w:tabs>
+        <w:ind w:left="3600" w:hanging="360"/>
+      </w:pPr>
+      <w:rPr>
+        <w:rFonts w:ascii="Wingdings" w:hAnsi="Wingdings" w:hint="default"/>
+        <w:sz w:val="20"/>
+      </w:rPr>
+    </w:lvl>
+    <w:lvl w:ilvl="5" w:tentative="1">
+      <w:start w:val="1"/>
+      <w:numFmt w:val="bullet"/>
+      <w:lvlText w:val=""/>
+      <w:lvlJc w:val="left"/>
+      <w:pPr>
+        <w:tabs>
+          <w:tab w:val="num" w:pos="4320"/>
+        </w:tabs>
+        <w:ind w:left="4320" w:hanging="360"/>
+      </w:pPr>
+      <w:rPr>
+        <w:rFonts w:ascii="Wingdings" w:hAnsi="Wingdings" w:hint="default"/>
+        <w:sz w:val="20"/>
+      </w:rPr>
+    </w:lvl>
+    <w:lvl w:ilvl="6" w:tentative="1">
+      <w:start w:val="1"/>
+      <w:numFmt w:val="bullet"/>
+      <w:lvlText w:val=""/>
+      <w:lvlJc w:val="left"/>
+      <w:pPr>
+        <w:tabs>
+          <w:tab w:val="num" w:pos="5040"/>
+        </w:tabs>
+        <w:ind w:left="5040" w:hanging="360"/>
+      </w:pPr>
+      <w:rPr>
+        <w:rFonts w:ascii="Wingdings" w:hAnsi="Wingdings" w:hint="default"/>
+        <w:sz w:val="20"/>
+      </w:rPr>
+    </w:lvl>
+    <w:lvl w:ilvl="7" w:tentative="1">
+      <w:start w:val="1"/>
+      <w:numFmt w:val="bullet"/>
+      <w:lvlText w:val=""/>
+      <w:lvlJc w:val="left"/>
+      <w:pPr>
+        <w:tabs>
+          <w:tab w:val="num" w:pos="5760"/>
+        </w:tabs>
+        <w:ind w:left="5760" w:hanging="360"/>
+      </w:pPr>
+      <w:rPr>
+        <w:rFonts w:ascii="Wingdings" w:hAnsi="Wingdings" w:hint="default"/>
+        <w:sz w:val="20"/>
+      </w:rPr>
+    </w:lvl>
+    <w:lvl w:ilvl="8" w:tentative="1">
+      <w:start w:val="1"/>
+      <w:numFmt w:val="bullet"/>
+      <w:lvlText w:val=""/>
+      <w:lvlJc w:val="left"/>
+      <w:pPr>
+        <w:tabs>
+          <w:tab w:val="num" w:pos="6480"/>
+        </w:tabs>
+        <w:ind w:left="6480" w:hanging="360"/>
+      </w:pPr>
+      <w:rPr>
+        <w:rFonts w:ascii="Wingdings" w:hAnsi="Wingdings" w:hint="default"/>
+        <w:sz w:val="20"/>
+      </w:rPr>
+    </w:lvl>
+  </w:abstractNum>
+  <w:abstractNum w:abstractNumId="16" w15:restartNumberingAfterBreak="0">
+    <w:nsid w:val="7A712473"/>
+    <w:multiLevelType w:val="multilevel"/>
+    <w:tmpl w:val="0B5C37BC"/>
+    <w:lvl w:ilvl="0">
+      <w:start w:val="1"/>
+      <w:numFmt w:val="bullet"/>
+      <w:lvlText w:val=""/>
+      <w:lvlJc w:val="left"/>
+      <w:pPr>
+        <w:tabs>
+          <w:tab w:val="num" w:pos="720"/>
+        </w:tabs>
+        <w:ind w:left="720" w:hanging="360"/>
+      </w:pPr>
+      <w:rPr>
+        <w:rFonts w:ascii="Symbol" w:hAnsi="Symbol" w:hint="default"/>
+        <w:sz w:val="20"/>
+      </w:rPr>
+    </w:lvl>
+    <w:lvl w:ilvl="1" w:tentative="1">
+      <w:start w:val="1"/>
+      <w:numFmt w:val="bullet"/>
+      <w:lvlText w:val="o"/>
+      <w:lvlJc w:val="left"/>
+      <w:pPr>
+        <w:tabs>
+          <w:tab w:val="num" w:pos="1440"/>
+        </w:tabs>
+        <w:ind w:left="1440" w:hanging="360"/>
+      </w:pPr>
+      <w:rPr>
+        <w:rFonts w:ascii="Courier New" w:hAnsi="Courier New" w:hint="default"/>
+        <w:sz w:val="20"/>
+      </w:rPr>
+    </w:lvl>
+    <w:lvl w:ilvl="2" w:tentative="1">
+      <w:start w:val="1"/>
+      <w:numFmt w:val="bullet"/>
+      <w:lvlText w:val=""/>
+      <w:lvlJc w:val="left"/>
+      <w:pPr>
+        <w:tabs>
+          <w:tab w:val="num" w:pos="2160"/>
+        </w:tabs>
+        <w:ind w:left="2160" w:hanging="360"/>
+      </w:pPr>
+      <w:rPr>
+        <w:rFonts w:ascii="Wingdings" w:hAnsi="Wingdings" w:hint="default"/>
+        <w:sz w:val="20"/>
+      </w:rPr>
+    </w:lvl>
+    <w:lvl w:ilvl="3" w:tentative="1">
+      <w:start w:val="1"/>
+      <w:numFmt w:val="bullet"/>
+      <w:lvlText w:val=""/>
+      <w:lvlJc w:val="left"/>
+      <w:pPr>
+        <w:tabs>
+          <w:tab w:val="num" w:pos="2880"/>
+        </w:tabs>
+        <w:ind w:left="2880" w:hanging="360"/>
+      </w:pPr>
+      <w:rPr>
+        <w:rFonts w:ascii="Wingdings" w:hAnsi="Wingdings" w:hint="default"/>
+        <w:sz w:val="20"/>
+      </w:rPr>
+    </w:lvl>
+    <w:lvl w:ilvl="4" w:tentative="1">
+      <w:start w:val="1"/>
+      <w:numFmt w:val="bullet"/>
+      <w:lvlText w:val=""/>
+      <w:lvlJc w:val="left"/>
+      <w:pPr>
+        <w:tabs>
+          <w:tab w:val="num" w:pos="3600"/>
+        </w:tabs>
+        <w:ind w:left="3600" w:hanging="360"/>
+      </w:pPr>
+      <w:rPr>
+        <w:rFonts w:ascii="Wingdings" w:hAnsi="Wingdings" w:hint="default"/>
+        <w:sz w:val="20"/>
+      </w:rPr>
+    </w:lvl>
+    <w:lvl w:ilvl="5" w:tentative="1">
+      <w:start w:val="1"/>
+      <w:numFmt w:val="bullet"/>
+      <w:lvlText w:val=""/>
+      <w:lvlJc w:val="left"/>
+      <w:pPr>
+        <w:tabs>
+          <w:tab w:val="num" w:pos="4320"/>
+        </w:tabs>
+        <w:ind w:left="4320" w:hanging="360"/>
+      </w:pPr>
+      <w:rPr>
+        <w:rFonts w:ascii="Wingdings" w:hAnsi="Wingdings" w:hint="default"/>
+        <w:sz w:val="20"/>
+      </w:rPr>
+    </w:lvl>
+    <w:lvl w:ilvl="6" w:tentative="1">
+      <w:start w:val="1"/>
+      <w:numFmt w:val="bullet"/>
+      <w:lvlText w:val=""/>
+      <w:lvlJc w:val="left"/>
+      <w:pPr>
+        <w:tabs>
+          <w:tab w:val="num" w:pos="5040"/>
+        </w:tabs>
+        <w:ind w:left="5040" w:hanging="360"/>
+      </w:pPr>
+      <w:rPr>
+        <w:rFonts w:ascii="Wingdings" w:hAnsi="Wingdings" w:hint="default"/>
+        <w:sz w:val="20"/>
+      </w:rPr>
+    </w:lvl>
+    <w:lvl w:ilvl="7" w:tentative="1">
+      <w:start w:val="1"/>
+      <w:numFmt w:val="bullet"/>
+      <w:lvlText w:val=""/>
+      <w:lvlJc w:val="left"/>
+      <w:pPr>
+        <w:tabs>
+          <w:tab w:val="num" w:pos="5760"/>
+        </w:tabs>
+        <w:ind w:left="5760" w:hanging="360"/>
+      </w:pPr>
+      <w:rPr>
+        <w:rFonts w:ascii="Wingdings" w:hAnsi="Wingdings" w:hint="default"/>
+        <w:sz w:val="20"/>
+      </w:rPr>
+    </w:lvl>
+    <w:lvl w:ilvl="8" w:tentative="1">
+      <w:start w:val="1"/>
+      <w:numFmt w:val="bullet"/>
+      <w:lvlText w:val=""/>
+      <w:lvlJc w:val="left"/>
+      <w:pPr>
+        <w:tabs>
+          <w:tab w:val="num" w:pos="6480"/>
+        </w:tabs>
+        <w:ind w:left="6480" w:hanging="360"/>
+      </w:pPr>
+      <w:rPr>
+        <w:rFonts w:ascii="Wingdings" w:hAnsi="Wingdings" w:hint="default"/>
+        <w:sz w:val="20"/>
+      </w:rPr>
+    </w:lvl>
+  </w:abstractNum>
+  <w:num w:numId="1" w16cid:durableId="1835798062">
+    <w:abstractNumId w:val="10"/>
+  </w:num>
+  <w:num w:numId="2" w16cid:durableId="1863663325">
+    <w:abstractNumId w:val="2"/>
+  </w:num>
+  <w:num w:numId="3" w16cid:durableId="1587687316">
+    <w:abstractNumId w:val="9"/>
+  </w:num>
+  <w:num w:numId="4" w16cid:durableId="717782364">
+    <w:abstractNumId w:val="12"/>
+  </w:num>
+  <w:num w:numId="5" w16cid:durableId="1320158257">
+    <w:abstractNumId w:val="16"/>
+  </w:num>
+  <w:num w:numId="6" w16cid:durableId="397629486">
+    <w:abstractNumId w:val="0"/>
+  </w:num>
+  <w:num w:numId="7" w16cid:durableId="1809082942">
+    <w:abstractNumId w:val="5"/>
+  </w:num>
+  <w:num w:numId="8" w16cid:durableId="1613781447">
+    <w:abstractNumId w:val="1"/>
+  </w:num>
+  <w:num w:numId="9" w16cid:durableId="973438535">
+    <w:abstractNumId w:val="13"/>
+  </w:num>
+  <w:num w:numId="10" w16cid:durableId="1069113249">
+    <w:abstractNumId w:val="4"/>
+  </w:num>
+  <w:num w:numId="11" w16cid:durableId="987901335">
+    <w:abstractNumId w:val="7"/>
+  </w:num>
+  <w:num w:numId="12" w16cid:durableId="1238512389">
+    <w:abstractNumId w:val="3"/>
+  </w:num>
+  <w:num w:numId="13" w16cid:durableId="476146660">
+    <w:abstractNumId w:val="15"/>
+  </w:num>
+  <w:num w:numId="14" w16cid:durableId="1513690928">
+    <w:abstractNumId w:val="11"/>
+  </w:num>
+  <w:num w:numId="15" w16cid:durableId="1866208526">
+    <w:abstractNumId w:val="6"/>
+  </w:num>
+  <w:num w:numId="16" w16cid:durableId="1893418020">
+    <w:abstractNumId w:val="14"/>
+  </w:num>
+  <w:num w:numId="17" w16cid:durableId="1327637281">
+    <w:abstractNumId w:val="8"/>
+  </w:num>
+</w:numbering>
 </file>
 
 <file path=word/styles.xml><?xml version="1.0" encoding="utf-8"?>

</xml_diff>